<commit_message>
chore: generate lesson 01 resources
</commit_message>
<xml_diff>
--- a/public/resources/lesson-01/02_1차시_학생활동지.docx
+++ b/public/resources/lesson-01/02_1차시_학생활동지.docx
@@ -30,7 +30,7 @@
             <w:r/>
             <w:r>
               <w:rPr>
-                <w:rFonts w:ascii="S-Core Dream" w:hAnsi="S-Core Dream" w:eastAsia="S-Core Dream"/>
+                <w:rFonts w:ascii="S-Core Dream" w:hAnsi="S-Core Dream" w:eastAsia="에스코어 드림"/>
                 <w:b/>
                 <w:color w:val="1F5D59"/>
                 <w:sz w:val="14"/>
@@ -44,7 +44,7 @@
             </w:pPr>
             <w:r>
               <w:rPr>
-                <w:rFonts w:ascii="S-Core Dream" w:hAnsi="S-Core Dream" w:eastAsia="S-Core Dream"/>
+                <w:rFonts w:ascii="S-Core Dream" w:hAnsi="S-Core Dream" w:eastAsia="에스코어 드림"/>
                 <w:b/>
                 <w:color w:val="233A3E"/>
                 <w:sz w:val="35"/>
@@ -55,7 +55,7 @@
           <w:p>
             <w:r>
               <w:rPr>
-                <w:rFonts w:ascii="S-Core Dream" w:hAnsi="S-Core Dream" w:eastAsia="S-Core Dream"/>
+                <w:rFonts w:ascii="S-Core Dream" w:hAnsi="S-Core Dream" w:eastAsia="에스코어 드림"/>
                 <w:b w:val="0"/>
                 <w:color w:val="647779"/>
                 <w:sz w:val="14"/>
@@ -84,7 +84,7 @@
             <w:r/>
             <w:r>
               <w:rPr>
-                <w:rFonts w:ascii="S-Core Dream" w:hAnsi="S-Core Dream" w:eastAsia="S-Core Dream"/>
+                <w:rFonts w:ascii="S-Core Dream" w:hAnsi="S-Core Dream" w:eastAsia="에스코어 드림"/>
                 <w:b/>
                 <w:color w:val="154541"/>
                 <w:sz w:val="16"/>
@@ -105,7 +105,7 @@
       </w:pPr>
       <w:r>
         <w:rPr>
-          <w:rFonts w:ascii="S-Core Dream" w:hAnsi="S-Core Dream" w:eastAsia="S-Core Dream"/>
+          <w:rFonts w:ascii="S-Core Dream" w:hAnsi="S-Core Dream" w:eastAsia="에스코어 드림"/>
           <w:b/>
           <w:color w:val="1F5D59"/>
           <w:sz w:val="18"/>
@@ -114,7 +114,7 @@
       </w:r>
       <w:r>
         <w:rPr>
-          <w:rFonts w:ascii="S-Core Dream" w:hAnsi="S-Core Dream" w:eastAsia="S-Core Dream"/>
+          <w:rFonts w:ascii="S-Core Dream" w:hAnsi="S-Core Dream" w:eastAsia="에스코어 드림"/>
           <w:b/>
           <w:color w:val="233A3E"/>
           <w:sz w:val="18"/>
@@ -165,7 +165,7 @@
             <w:r/>
             <w:r>
               <w:rPr>
-                <w:rFonts w:ascii="S-Core Dream" w:hAnsi="S-Core Dream" w:eastAsia="S-Core Dream"/>
+                <w:rFonts w:ascii="S-Core Dream" w:hAnsi="S-Core Dream" w:eastAsia="에스코어 드림"/>
                 <w:b w:val="0"/>
                 <w:color w:val="233A3E"/>
                 <w:sz w:val="15"/>
@@ -194,7 +194,7 @@
             <w:r/>
             <w:r>
               <w:rPr>
-                <w:rFonts w:ascii="S-Core Dream" w:hAnsi="S-Core Dream" w:eastAsia="S-Core Dream"/>
+                <w:rFonts w:ascii="S-Core Dream" w:hAnsi="S-Core Dream" w:eastAsia="에스코어 드림"/>
                 <w:b w:val="0"/>
                 <w:color w:val="233A3E"/>
                 <w:sz w:val="15"/>
@@ -223,7 +223,7 @@
             <w:r/>
             <w:r>
               <w:rPr>
-                <w:rFonts w:ascii="S-Core Dream" w:hAnsi="S-Core Dream" w:eastAsia="S-Core Dream"/>
+                <w:rFonts w:ascii="S-Core Dream" w:hAnsi="S-Core Dream" w:eastAsia="에스코어 드림"/>
                 <w:b w:val="0"/>
                 <w:color w:val="233A3E"/>
                 <w:sz w:val="15"/>
@@ -257,7 +257,7 @@
             <w:r/>
             <w:r>
               <w:rPr>
-                <w:rFonts w:ascii="S-Core Dream" w:hAnsi="S-Core Dream" w:eastAsia="S-Core Dream"/>
+                <w:rFonts w:ascii="S-Core Dream" w:hAnsi="S-Core Dream" w:eastAsia="에스코어 드림"/>
                 <w:b w:val="0"/>
                 <w:color w:val="233A3E"/>
                 <w:sz w:val="15"/>
@@ -286,7 +286,7 @@
             <w:r/>
             <w:r>
               <w:rPr>
-                <w:rFonts w:ascii="S-Core Dream" w:hAnsi="S-Core Dream" w:eastAsia="S-Core Dream"/>
+                <w:rFonts w:ascii="S-Core Dream" w:hAnsi="S-Core Dream" w:eastAsia="에스코어 드림"/>
                 <w:b w:val="0"/>
                 <w:color w:val="233A3E"/>
                 <w:sz w:val="15"/>
@@ -315,7 +315,7 @@
             <w:r/>
             <w:r>
               <w:rPr>
-                <w:rFonts w:ascii="S-Core Dream" w:hAnsi="S-Core Dream" w:eastAsia="S-Core Dream"/>
+                <w:rFonts w:ascii="S-Core Dream" w:hAnsi="S-Core Dream" w:eastAsia="에스코어 드림"/>
                 <w:b w:val="0"/>
                 <w:color w:val="233A3E"/>
                 <w:sz w:val="15"/>
@@ -332,7 +332,7 @@
       </w:pPr>
       <w:r>
         <w:rPr>
-          <w:rFonts w:ascii="S-Core Dream" w:hAnsi="S-Core Dream" w:eastAsia="S-Core Dream"/>
+          <w:rFonts w:ascii="S-Core Dream" w:hAnsi="S-Core Dream" w:eastAsia="에스코어 드림"/>
           <w:b/>
           <w:color w:val="1F5D59"/>
           <w:sz w:val="18"/>
@@ -341,7 +341,7 @@
       </w:r>
       <w:r>
         <w:rPr>
-          <w:rFonts w:ascii="S-Core Dream" w:hAnsi="S-Core Dream" w:eastAsia="S-Core Dream"/>
+          <w:rFonts w:ascii="S-Core Dream" w:hAnsi="S-Core Dream" w:eastAsia="에스코어 드림"/>
           <w:b/>
           <w:color w:val="233A3E"/>
           <w:sz w:val="18"/>
@@ -386,7 +386,7 @@
             <w:r/>
             <w:r>
               <w:rPr>
-                <w:rFonts w:ascii="S-Core Dream" w:hAnsi="S-Core Dream" w:eastAsia="S-Core Dream"/>
+                <w:rFonts w:ascii="S-Core Dream" w:hAnsi="S-Core Dream" w:eastAsia="에스코어 드림"/>
                 <w:b/>
                 <w:color w:val="154541"/>
                 <w:sz w:val="17"/>
@@ -436,7 +436,7 @@
             <w:r/>
             <w:r>
               <w:rPr>
-                <w:rFonts w:ascii="S-Core Dream" w:hAnsi="S-Core Dream" w:eastAsia="S-Core Dream"/>
+                <w:rFonts w:ascii="S-Core Dream" w:hAnsi="S-Core Dream" w:eastAsia="에스코어 드림"/>
                 <w:b w:val="0"/>
                 <w:color w:val="AFC0B9"/>
                 <w:sz w:val="14"/>
@@ -453,7 +453,7 @@
       </w:pPr>
       <w:r>
         <w:rPr>
-          <w:rFonts w:ascii="S-Core Dream" w:hAnsi="S-Core Dream" w:eastAsia="S-Core Dream"/>
+          <w:rFonts w:ascii="S-Core Dream" w:hAnsi="S-Core Dream" w:eastAsia="에스코어 드림"/>
           <w:b/>
           <w:color w:val="1F5D59"/>
           <w:sz w:val="18"/>
@@ -462,7 +462,7 @@
       </w:r>
       <w:r>
         <w:rPr>
-          <w:rFonts w:ascii="S-Core Dream" w:hAnsi="S-Core Dream" w:eastAsia="S-Core Dream"/>
+          <w:rFonts w:ascii="S-Core Dream" w:hAnsi="S-Core Dream" w:eastAsia="에스코어 드림"/>
           <w:b/>
           <w:color w:val="233A3E"/>
           <w:sz w:val="18"/>
@@ -511,7 +511,7 @@
             <w:r/>
             <w:r>
               <w:rPr>
-                <w:rFonts w:ascii="S-Core Dream" w:hAnsi="S-Core Dream" w:eastAsia="S-Core Dream"/>
+                <w:rFonts w:ascii="S-Core Dream" w:hAnsi="S-Core Dream" w:eastAsia="에스코어 드림"/>
                 <w:b/>
                 <w:color w:val="154541"/>
                 <w:sz w:val="15"/>
@@ -540,7 +540,7 @@
             <w:r/>
             <w:r>
               <w:rPr>
-                <w:rFonts w:ascii="S-Core Dream" w:hAnsi="S-Core Dream" w:eastAsia="S-Core Dream"/>
+                <w:rFonts w:ascii="S-Core Dream" w:hAnsi="S-Core Dream" w:eastAsia="에스코어 드림"/>
                 <w:b/>
                 <w:color w:val="154541"/>
                 <w:sz w:val="15"/>
@@ -573,7 +573,7 @@
             <w:r/>
             <w:r>
               <w:rPr>
-                <w:rFonts w:ascii="S-Core Dream" w:hAnsi="S-Core Dream" w:eastAsia="S-Core Dream"/>
+                <w:rFonts w:ascii="S-Core Dream" w:hAnsi="S-Core Dream" w:eastAsia="에스코어 드림"/>
                 <w:b w:val="0"/>
                 <w:color w:val="233A3E"/>
                 <w:sz w:val="15"/>
@@ -601,7 +601,7 @@
             <w:r/>
             <w:r>
               <w:rPr>
-                <w:rFonts w:ascii="S-Core Dream" w:hAnsi="S-Core Dream" w:eastAsia="S-Core Dream"/>
+                <w:rFonts w:ascii="S-Core Dream" w:hAnsi="S-Core Dream" w:eastAsia="에스코어 드림"/>
                 <w:b w:val="0"/>
                 <w:color w:val="233A3E"/>
                 <w:sz w:val="15"/>
@@ -618,7 +618,7 @@
       </w:pPr>
       <w:r>
         <w:rPr>
-          <w:rFonts w:ascii="S-Core Dream" w:hAnsi="S-Core Dream" w:eastAsia="S-Core Dream"/>
+          <w:rFonts w:ascii="S-Core Dream" w:hAnsi="S-Core Dream" w:eastAsia="에스코어 드림"/>
           <w:b/>
           <w:color w:val="1F5D59"/>
           <w:sz w:val="18"/>
@@ -627,7 +627,7 @@
       </w:r>
       <w:r>
         <w:rPr>
-          <w:rFonts w:ascii="S-Core Dream" w:hAnsi="S-Core Dream" w:eastAsia="S-Core Dream"/>
+          <w:rFonts w:ascii="S-Core Dream" w:hAnsi="S-Core Dream" w:eastAsia="에스코어 드림"/>
           <w:b/>
           <w:color w:val="233A3E"/>
           <w:sz w:val="18"/>
@@ -675,7 +675,7 @@
             <w:r/>
             <w:r>
               <w:rPr>
-                <w:rFonts w:ascii="S-Core Dream" w:hAnsi="S-Core Dream" w:eastAsia="S-Core Dream"/>
+                <w:rFonts w:ascii="S-Core Dream" w:hAnsi="S-Core Dream" w:eastAsia="에스코어 드림"/>
                 <w:b w:val="0"/>
                 <w:color w:val="233A3E"/>
                 <w:sz w:val="16"/>
@@ -692,7 +692,7 @@
       </w:pPr>
       <w:r>
         <w:rPr>
-          <w:rFonts w:ascii="S-Core Dream" w:hAnsi="S-Core Dream" w:eastAsia="S-Core Dream"/>
+          <w:rFonts w:ascii="S-Core Dream" w:hAnsi="S-Core Dream" w:eastAsia="에스코어 드림"/>
           <w:b/>
           <w:color w:val="1F5D59"/>
           <w:sz w:val="18"/>
@@ -701,7 +701,7 @@
       </w:r>
       <w:r>
         <w:rPr>
-          <w:rFonts w:ascii="S-Core Dream" w:hAnsi="S-Core Dream" w:eastAsia="S-Core Dream"/>
+          <w:rFonts w:ascii="S-Core Dream" w:hAnsi="S-Core Dream" w:eastAsia="에스코어 드림"/>
           <w:b/>
           <w:color w:val="233A3E"/>
           <w:sz w:val="18"/>
@@ -748,7 +748,7 @@
             <w:r/>
             <w:r>
               <w:rPr>
-                <w:rFonts w:ascii="S-Core Dream" w:hAnsi="S-Core Dream" w:eastAsia="S-Core Dream"/>
+                <w:rFonts w:ascii="S-Core Dream" w:hAnsi="S-Core Dream" w:eastAsia="에스코어 드림"/>
                 <w:b w:val="0"/>
                 <w:color w:val="233A3E"/>
                 <w:sz w:val="16"/>
@@ -807,7 +807,7 @@
           <w:r/>
           <w:r>
             <w:rPr>
-              <w:rFonts w:ascii="S-Core Dream" w:hAnsi="S-Core Dream" w:eastAsia="S-Core Dream"/>
+              <w:rFonts w:ascii="S-Core Dream" w:hAnsi="S-Core Dream" w:eastAsia="에스코어 드림"/>
               <w:b w:val="0"/>
               <w:color w:val="647779"/>
               <w:sz w:val="12"/>
@@ -835,7 +835,7 @@
           <w:r/>
           <w:r>
             <w:rPr>
-              <w:rFonts w:ascii="S-Core Dream" w:hAnsi="S-Core Dream" w:eastAsia="S-Core Dream"/>
+              <w:rFonts w:ascii="S-Core Dream" w:hAnsi="S-Core Dream" w:eastAsia="에스코어 드림"/>
               <w:b w:val="0"/>
               <w:color w:val="647779"/>
               <w:sz w:val="12"/>
@@ -1216,7 +1216,7 @@
       <w:spacing w:after="0"/>
     </w:pPr>
     <w:rPr>
-      <w:rFonts w:ascii="S-Core Dream" w:hAnsi="S-Core Dream" w:eastAsia="S-Core Dream"/>
+      <w:rFonts w:ascii="S-Core Dream" w:hAnsi="S-Core Dream" w:eastAsia="에스코어 드림"/>
       <w:sz w:val="16"/>
     </w:rPr>
   </w:style>

</xml_diff>

<commit_message>
feat: redesign lesson 01 as observation-based AI lesson
</commit_message>
<xml_diff>
--- a/public/resources/lesson-01/02_1차시_학생활동지.docx
+++ b/public/resources/lesson-01/02_1차시_학생활동지.docx
@@ -49,7 +49,7 @@
                 <w:color w:val="233A3E"/>
                 <w:sz w:val="35"/>
               </w:rPr>
-              <w:t>사람과 AI, 누가 더 잘 볼까?</w:t>
+              <w:t>자동으로 움직이면 모두 AI일까?</w:t>
             </w:r>
           </w:p>
           <w:p>
@@ -119,234 +119,7 @@
           <w:color w:val="233A3E"/>
           <w:sz w:val="18"/>
         </w:rPr>
-        <w:t>생활 속 AI라고 생각하는 장면에 ○표 하세요.</w:t>
-      </w:r>
-    </w:p>
-    <w:tbl>
-      <w:tblPr>
-        <w:tblW w:type="auto" w:w="0"/>
-        <w:jc w:val="center"/>
-        <w:tblLook w:firstColumn="1" w:firstRow="1" w:lastColumn="0" w:lastRow="0" w:noHBand="0" w:noVBand="1" w:val="04A0"/>
-        <w:tblBorders>
-          <w:top w:val="single" w:sz="5" w:space="0" w:color="AFC0B9"/>
-          <w:left w:val="single" w:sz="5" w:space="0" w:color="AFC0B9"/>
-          <w:bottom w:val="single" w:sz="5" w:space="0" w:color="AFC0B9"/>
-          <w:right w:val="single" w:sz="5" w:space="0" w:color="AFC0B9"/>
-          <w:insideH w:val="single" w:sz="5" w:space="0" w:color="AFC0B9"/>
-          <w:insideV w:val="single" w:sz="5" w:space="0" w:color="AFC0B9"/>
-        </w:tblBorders>
-      </w:tblPr>
-      <w:tblGrid>
-        <w:gridCol w:w="3553"/>
-        <w:gridCol w:w="3553"/>
-        <w:gridCol w:w="3553"/>
-      </w:tblGrid>
-      <w:tr>
-        <w:trPr>
-          <w:trHeight w:val="539" w:hRule="exact"/>
-        </w:trPr>
-        <w:tc>
-          <w:tcPr>
-            <w:tcW w:type="dxa" w:w="3553"/>
-            <w:vAlign w:val="center"/>
-            <w:tcMar>
-              <w:top w:w="70" w:type="dxa"/>
-              <w:start w:w="80" w:type="dxa"/>
-              <w:bottom w:w="70" w:type="dxa"/>
-              <w:end w:w="80" w:type="dxa"/>
-            </w:tcMar>
-            <w:shd w:fill="FFFDF7"/>
-          </w:tcPr>
-          <w:p>
-            <w:pPr>
-              <w:spacing w:after="0" w:line="269" w:lineRule="auto"/>
-              <w:jc w:val="left"/>
-            </w:pPr>
-            <w:r/>
-            <w:r>
-              <w:rPr>
-                <w:rFonts w:ascii="S-Core Dream" w:hAnsi="S-Core Dream" w:eastAsia="에스코어 드림"/>
-                <w:b w:val="0"/>
-                <w:color w:val="233A3E"/>
-                <w:sz w:val="15"/>
-              </w:rPr>
-              <w:t>○ 좋아할 영상 추천</w:t>
-            </w:r>
-          </w:p>
-        </w:tc>
-        <w:tc>
-          <w:tcPr>
-            <w:tcW w:type="dxa" w:w="3553"/>
-            <w:vAlign w:val="center"/>
-            <w:tcMar>
-              <w:top w:w="70" w:type="dxa"/>
-              <w:start w:w="80" w:type="dxa"/>
-              <w:bottom w:w="70" w:type="dxa"/>
-              <w:end w:w="80" w:type="dxa"/>
-            </w:tcMar>
-            <w:shd w:fill="FFFDF7"/>
-          </w:tcPr>
-          <w:p>
-            <w:pPr>
-              <w:spacing w:after="0" w:line="269" w:lineRule="auto"/>
-              <w:jc w:val="left"/>
-            </w:pPr>
-            <w:r/>
-            <w:r>
-              <w:rPr>
-                <w:rFonts w:ascii="S-Core Dream" w:hAnsi="S-Core Dream" w:eastAsia="에스코어 드림"/>
-                <w:b w:val="0"/>
-                <w:color w:val="233A3E"/>
-                <w:sz w:val="15"/>
-              </w:rPr>
-              <w:t>○ 음성으로 날씨 묻기</w:t>
-            </w:r>
-          </w:p>
-        </w:tc>
-        <w:tc>
-          <w:tcPr>
-            <w:tcW w:type="dxa" w:w="3553"/>
-            <w:vAlign w:val="center"/>
-            <w:tcMar>
-              <w:top w:w="70" w:type="dxa"/>
-              <w:start w:w="80" w:type="dxa"/>
-              <w:bottom w:w="70" w:type="dxa"/>
-              <w:end w:w="80" w:type="dxa"/>
-            </w:tcMar>
-            <w:shd w:fill="FFFDF7"/>
-          </w:tcPr>
-          <w:p>
-            <w:pPr>
-              <w:spacing w:after="0" w:line="269" w:lineRule="auto"/>
-              <w:jc w:val="left"/>
-            </w:pPr>
-            <w:r/>
-            <w:r>
-              <w:rPr>
-                <w:rFonts w:ascii="S-Core Dream" w:hAnsi="S-Core Dream" w:eastAsia="에스코어 드림"/>
-                <w:b w:val="0"/>
-                <w:color w:val="233A3E"/>
-                <w:sz w:val="15"/>
-              </w:rPr>
-              <w:t>○ 얼굴 인식 잠금</w:t>
-            </w:r>
-          </w:p>
-        </w:tc>
-      </w:tr>
-      <w:tr>
-        <w:trPr>
-          <w:trHeight w:val="539" w:hRule="exact"/>
-        </w:trPr>
-        <w:tc>
-          <w:tcPr>
-            <w:tcW w:type="dxa" w:w="3553"/>
-            <w:vAlign w:val="center"/>
-            <w:tcMar>
-              <w:top w:w="70" w:type="dxa"/>
-              <w:start w:w="80" w:type="dxa"/>
-              <w:bottom w:w="70" w:type="dxa"/>
-              <w:end w:w="80" w:type="dxa"/>
-            </w:tcMar>
-            <w:shd w:fill="FFFDF7"/>
-          </w:tcPr>
-          <w:p>
-            <w:pPr>
-              <w:spacing w:after="0" w:line="269" w:lineRule="auto"/>
-              <w:jc w:val="left"/>
-            </w:pPr>
-            <w:r/>
-            <w:r>
-              <w:rPr>
-                <w:rFonts w:ascii="S-Core Dream" w:hAnsi="S-Core Dream" w:eastAsia="에스코어 드림"/>
-                <w:b w:val="0"/>
-                <w:color w:val="233A3E"/>
-                <w:sz w:val="15"/>
-              </w:rPr>
-              <w:t>○ 전등 스위치</w:t>
-            </w:r>
-          </w:p>
-        </w:tc>
-        <w:tc>
-          <w:tcPr>
-            <w:tcW w:type="dxa" w:w="3553"/>
-            <w:vAlign w:val="center"/>
-            <w:tcMar>
-              <w:top w:w="70" w:type="dxa"/>
-              <w:start w:w="80" w:type="dxa"/>
-              <w:bottom w:w="70" w:type="dxa"/>
-              <w:end w:w="80" w:type="dxa"/>
-            </w:tcMar>
-            <w:shd w:fill="FFFDF7"/>
-          </w:tcPr>
-          <w:p>
-            <w:pPr>
-              <w:spacing w:after="0" w:line="269" w:lineRule="auto"/>
-              <w:jc w:val="left"/>
-            </w:pPr>
-            <w:r/>
-            <w:r>
-              <w:rPr>
-                <w:rFonts w:ascii="S-Core Dream" w:hAnsi="S-Core Dream" w:eastAsia="에스코어 드림"/>
-                <w:b w:val="0"/>
-                <w:color w:val="233A3E"/>
-                <w:sz w:val="15"/>
-              </w:rPr>
-              <w:t>○ 자로 길이 재기</w:t>
-            </w:r>
-          </w:p>
-        </w:tc>
-        <w:tc>
-          <w:tcPr>
-            <w:tcW w:type="dxa" w:w="3553"/>
-            <w:vAlign w:val="center"/>
-            <w:tcMar>
-              <w:top w:w="70" w:type="dxa"/>
-              <w:start w:w="80" w:type="dxa"/>
-              <w:bottom w:w="70" w:type="dxa"/>
-              <w:end w:w="80" w:type="dxa"/>
-            </w:tcMar>
-            <w:shd w:fill="FFFDF7"/>
-          </w:tcPr>
-          <w:p>
-            <w:pPr>
-              <w:spacing w:after="0" w:line="269" w:lineRule="auto"/>
-              <w:jc w:val="left"/>
-            </w:pPr>
-            <w:r/>
-            <w:r>
-              <w:rPr>
-                <w:rFonts w:ascii="S-Core Dream" w:hAnsi="S-Core Dream" w:eastAsia="에스코어 드림"/>
-                <w:b w:val="0"/>
-                <w:color w:val="233A3E"/>
-                <w:sz w:val="15"/>
-              </w:rPr>
-              <w:t>○ 자동 번역</w:t>
-            </w:r>
-          </w:p>
-        </w:tc>
-      </w:tr>
-    </w:tbl>
-    <w:p>
-      <w:pPr>
-        <w:spacing w:before="60" w:after="30"/>
-      </w:pPr>
-      <w:r>
-        <w:rPr>
-          <w:rFonts w:ascii="S-Core Dream" w:hAnsi="S-Core Dream" w:eastAsia="에스코어 드림"/>
-          <w:b/>
-          <w:color w:val="1F5D59"/>
-          <w:sz w:val="18"/>
-        </w:rPr>
-        <w:t xml:space="preserve">2  </w:t>
-      </w:r>
-      <w:r>
-        <w:rPr>
-          <w:rFonts w:ascii="S-Core Dream" w:hAnsi="S-Core Dream" w:eastAsia="에스코어 드림"/>
-          <w:b/>
-          <w:color w:val="233A3E"/>
-          <w:sz w:val="18"/>
-        </w:rPr>
-        <w:t>문장을 읽고 내가 상상한 장면을 그려 보세요.</w:t>
+        <w:t>각 사례를 보고 알맞은 기능을 써 보세요.</w:t>
       </w:r>
     </w:p>
     <w:tbl>
@@ -389,9 +162,9 @@
                 <w:rFonts w:ascii="S-Core Dream" w:hAnsi="S-Core Dream" w:eastAsia="에스코어 드림"/>
                 <w:b/>
                 <w:color w:val="154541"/>
-                <w:sz w:val="17"/>
+                <w:sz w:val="16"/>
               </w:rPr>
-              <w:t>“비 오는 날, 빨간 우산을 쓴 아이가 골목길을 걷고 있습니다.”</w:t>
+              <w:t>보기   추천  ·  인식  ·  분류  ·  자동 기계</w:t>
             </w:r>
           </w:p>
         </w:tc>
@@ -400,26 +173,122 @@
     <w:tbl>
       <w:tblPr>
         <w:tblW w:type="auto" w:w="0"/>
+        <w:jc w:val="center"/>
+        <w:tblLayout w:type="fixed"/>
         <w:tblLook w:firstColumn="1" w:firstRow="1" w:lastColumn="0" w:lastRow="0" w:noHBand="0" w:noVBand="1" w:val="04A0"/>
         <w:tblBorders>
-          <w:top w:val="single" w:sz="6" w:space="0" w:color="778482"/>
-          <w:left w:val="single" w:sz="6" w:space="0" w:color="778482"/>
-          <w:bottom w:val="single" w:sz="6" w:space="0" w:color="778482"/>
-          <w:right w:val="single" w:sz="6" w:space="0" w:color="778482"/>
-          <w:insideH w:val="single" w:sz="6" w:space="0" w:color="778482"/>
-          <w:insideV w:val="single" w:sz="6" w:space="0" w:color="778482"/>
+          <w:top w:val="single" w:sz="5" w:space="0" w:color="AFC0B9"/>
+          <w:left w:val="single" w:sz="5" w:space="0" w:color="AFC0B9"/>
+          <w:bottom w:val="single" w:sz="5" w:space="0" w:color="AFC0B9"/>
+          <w:right w:val="single" w:sz="5" w:space="0" w:color="AFC0B9"/>
+          <w:insideH w:val="single" w:sz="5" w:space="0" w:color="AFC0B9"/>
+          <w:insideV w:val="single" w:sz="5" w:space="0" w:color="AFC0B9"/>
         </w:tblBorders>
       </w:tblPr>
       <w:tblGrid>
-        <w:gridCol w:w="10658"/>
+        <w:gridCol w:w="907"/>
+        <w:gridCol w:w="6746"/>
+        <w:gridCol w:w="2665"/>
       </w:tblGrid>
       <w:tr>
         <w:trPr>
-          <w:trHeight w:val="4479" w:hRule="exact"/>
+          <w:trHeight w:val="414" w:hRule="exact"/>
         </w:trPr>
         <w:tc>
           <w:tcPr>
-            <w:tcW w:type="dxa" w:w="10658"/>
+            <w:tcW w:type="dxa" w:w="907"/>
+            <w:vAlign w:val="center"/>
+            <w:tcMar>
+              <w:top w:w="70" w:type="dxa"/>
+              <w:start w:w="80" w:type="dxa"/>
+              <w:bottom w:w="70" w:type="dxa"/>
+              <w:end w:w="80" w:type="dxa"/>
+            </w:tcMar>
+            <w:shd w:fill="E4EFEA"/>
+          </w:tcPr>
+          <w:p>
+            <w:pPr>
+              <w:spacing w:after="0" w:line="269" w:lineRule="auto"/>
+              <w:jc w:val="center"/>
+            </w:pPr>
+            <w:r/>
+            <w:r>
+              <w:rPr>
+                <w:rFonts w:ascii="S-Core Dream" w:hAnsi="S-Core Dream" w:eastAsia="에스코어 드림"/>
+                <w:b/>
+                <w:color w:val="154541"/>
+                <w:sz w:val="15"/>
+              </w:rPr>
+              <w:t>번호</w:t>
+            </w:r>
+          </w:p>
+        </w:tc>
+        <w:tc>
+          <w:tcPr>
+            <w:tcW w:type="dxa" w:w="6746"/>
+            <w:vAlign w:val="center"/>
+            <w:tcMar>
+              <w:top w:w="70" w:type="dxa"/>
+              <w:start w:w="80" w:type="dxa"/>
+              <w:bottom w:w="70" w:type="dxa"/>
+              <w:end w:w="80" w:type="dxa"/>
+            </w:tcMar>
+            <w:shd w:fill="E4EFEA"/>
+          </w:tcPr>
+          <w:p>
+            <w:pPr>
+              <w:spacing w:after="0" w:line="269" w:lineRule="auto"/>
+              <w:jc w:val="center"/>
+            </w:pPr>
+            <w:r/>
+            <w:r>
+              <w:rPr>
+                <w:rFonts w:ascii="S-Core Dream" w:hAnsi="S-Core Dream" w:eastAsia="에스코어 드림"/>
+                <w:b/>
+                <w:color w:val="154541"/>
+                <w:sz w:val="15"/>
+              </w:rPr>
+              <w:t>사례</w:t>
+            </w:r>
+          </w:p>
+        </w:tc>
+        <w:tc>
+          <w:tcPr>
+            <w:tcW w:type="dxa" w:w="2665"/>
+            <w:vAlign w:val="center"/>
+            <w:tcMar>
+              <w:top w:w="70" w:type="dxa"/>
+              <w:start w:w="80" w:type="dxa"/>
+              <w:bottom w:w="70" w:type="dxa"/>
+              <w:end w:w="80" w:type="dxa"/>
+            </w:tcMar>
+            <w:shd w:fill="E4EFEA"/>
+          </w:tcPr>
+          <w:p>
+            <w:pPr>
+              <w:spacing w:after="0" w:line="269" w:lineRule="auto"/>
+              <w:jc w:val="center"/>
+            </w:pPr>
+            <w:r/>
+            <w:r>
+              <w:rPr>
+                <w:rFonts w:ascii="S-Core Dream" w:hAnsi="S-Core Dream" w:eastAsia="에스코어 드림"/>
+                <w:b/>
+                <w:color w:val="154541"/>
+                <w:sz w:val="15"/>
+              </w:rPr>
+              <w:t>기능</w:t>
+            </w:r>
+          </w:p>
+        </w:tc>
+      </w:tr>
+      <w:tr>
+        <w:trPr>
+          <w:trHeight w:val="414" w:hRule="exact"/>
+        </w:trPr>
+        <w:tc>
+          <w:tcPr>
+            <w:tcW w:type="dxa" w:w="907"/>
             <w:vAlign w:val="center"/>
             <w:tcMar>
               <w:top w:w="70" w:type="dxa"/>
@@ -438,10 +307,701 @@
               <w:rPr>
                 <w:rFonts w:ascii="S-Core Dream" w:hAnsi="S-Core Dream" w:eastAsia="에스코어 드림"/>
                 <w:b w:val="0"/>
-                <w:color w:val="AFC0B9"/>
+                <w:color w:val="233A3E"/>
                 <w:sz w:val="14"/>
               </w:rPr>
-              <w:t>내가 떠올린 장면을 그리는 곳</w:t>
+              <w:t>1</w:t>
+            </w:r>
+          </w:p>
+        </w:tc>
+        <w:tc>
+          <w:tcPr>
+            <w:tcW w:type="dxa" w:w="6746"/>
+            <w:vAlign w:val="center"/>
+            <w:tcMar>
+              <w:top w:w="70" w:type="dxa"/>
+              <w:start w:w="80" w:type="dxa"/>
+              <w:bottom w:w="70" w:type="dxa"/>
+              <w:end w:w="80" w:type="dxa"/>
+            </w:tcMar>
+          </w:tcPr>
+          <w:p>
+            <w:pPr>
+              <w:spacing w:after="0" w:line="269" w:lineRule="auto"/>
+              <w:jc w:val="left"/>
+            </w:pPr>
+            <w:r/>
+            <w:r>
+              <w:rPr>
+                <w:rFonts w:ascii="S-Core Dream" w:hAnsi="S-Core Dream" w:eastAsia="에스코어 드림"/>
+                <w:b w:val="0"/>
+                <w:color w:val="233A3E"/>
+                <w:sz w:val="15"/>
+              </w:rPr>
+              <w:t>좋아할 영상 골라 주기</w:t>
+            </w:r>
+          </w:p>
+        </w:tc>
+        <w:tc>
+          <w:tcPr>
+            <w:tcW w:type="dxa" w:w="2665"/>
+            <w:vAlign w:val="center"/>
+            <w:tcMar>
+              <w:top w:w="70" w:type="dxa"/>
+              <w:start w:w="80" w:type="dxa"/>
+              <w:bottom w:w="70" w:type="dxa"/>
+              <w:end w:w="80" w:type="dxa"/>
+            </w:tcMar>
+          </w:tcPr>
+          <w:p>
+            <w:pPr>
+              <w:spacing w:after="0" w:line="269" w:lineRule="auto"/>
+              <w:jc w:val="center"/>
+            </w:pPr>
+            <w:r/>
+            <w:r>
+              <w:rPr>
+                <w:rFonts w:ascii="S-Core Dream" w:hAnsi="S-Core Dream" w:eastAsia="에스코어 드림"/>
+                <w:b w:val="0"/>
+                <w:color w:val="154541"/>
+                <w:sz w:val="14"/>
+              </w:rPr>
+              <w:t>________________</w:t>
+            </w:r>
+          </w:p>
+        </w:tc>
+      </w:tr>
+      <w:tr>
+        <w:trPr>
+          <w:trHeight w:val="414" w:hRule="exact"/>
+        </w:trPr>
+        <w:tc>
+          <w:tcPr>
+            <w:tcW w:type="dxa" w:w="907"/>
+            <w:vAlign w:val="center"/>
+            <w:tcMar>
+              <w:top w:w="70" w:type="dxa"/>
+              <w:start w:w="80" w:type="dxa"/>
+              <w:bottom w:w="70" w:type="dxa"/>
+              <w:end w:w="80" w:type="dxa"/>
+            </w:tcMar>
+            <w:shd w:fill="FFFDF7"/>
+          </w:tcPr>
+          <w:p>
+            <w:pPr>
+              <w:spacing w:after="0" w:line="269" w:lineRule="auto"/>
+              <w:jc w:val="center"/>
+            </w:pPr>
+            <w:r/>
+            <w:r>
+              <w:rPr>
+                <w:rFonts w:ascii="S-Core Dream" w:hAnsi="S-Core Dream" w:eastAsia="에스코어 드림"/>
+                <w:b w:val="0"/>
+                <w:color w:val="233A3E"/>
+                <w:sz w:val="14"/>
+              </w:rPr>
+              <w:t>2</w:t>
+            </w:r>
+          </w:p>
+        </w:tc>
+        <w:tc>
+          <w:tcPr>
+            <w:tcW w:type="dxa" w:w="6746"/>
+            <w:vAlign w:val="center"/>
+            <w:tcMar>
+              <w:top w:w="70" w:type="dxa"/>
+              <w:start w:w="80" w:type="dxa"/>
+              <w:bottom w:w="70" w:type="dxa"/>
+              <w:end w:w="80" w:type="dxa"/>
+            </w:tcMar>
+            <w:shd w:fill="FFFDF7"/>
+          </w:tcPr>
+          <w:p>
+            <w:pPr>
+              <w:spacing w:after="0" w:line="269" w:lineRule="auto"/>
+              <w:jc w:val="left"/>
+            </w:pPr>
+            <w:r/>
+            <w:r>
+              <w:rPr>
+                <w:rFonts w:ascii="S-Core Dream" w:hAnsi="S-Core Dream" w:eastAsia="에스코어 드림"/>
+                <w:b w:val="0"/>
+                <w:color w:val="233A3E"/>
+                <w:sz w:val="15"/>
+              </w:rPr>
+              <w:t>다음에 읽을 책 골라 주기</w:t>
+            </w:r>
+          </w:p>
+        </w:tc>
+        <w:tc>
+          <w:tcPr>
+            <w:tcW w:type="dxa" w:w="2665"/>
+            <w:vAlign w:val="center"/>
+            <w:tcMar>
+              <w:top w:w="70" w:type="dxa"/>
+              <w:start w:w="80" w:type="dxa"/>
+              <w:bottom w:w="70" w:type="dxa"/>
+              <w:end w:w="80" w:type="dxa"/>
+            </w:tcMar>
+            <w:shd w:fill="FFFDF7"/>
+          </w:tcPr>
+          <w:p>
+            <w:pPr>
+              <w:spacing w:after="0" w:line="269" w:lineRule="auto"/>
+              <w:jc w:val="center"/>
+            </w:pPr>
+            <w:r/>
+            <w:r>
+              <w:rPr>
+                <w:rFonts w:ascii="S-Core Dream" w:hAnsi="S-Core Dream" w:eastAsia="에스코어 드림"/>
+                <w:b w:val="0"/>
+                <w:color w:val="154541"/>
+                <w:sz w:val="14"/>
+              </w:rPr>
+              <w:t>________________</w:t>
+            </w:r>
+          </w:p>
+        </w:tc>
+      </w:tr>
+      <w:tr>
+        <w:trPr>
+          <w:trHeight w:val="414" w:hRule="exact"/>
+        </w:trPr>
+        <w:tc>
+          <w:tcPr>
+            <w:tcW w:type="dxa" w:w="907"/>
+            <w:vAlign w:val="center"/>
+            <w:tcMar>
+              <w:top w:w="70" w:type="dxa"/>
+              <w:start w:w="80" w:type="dxa"/>
+              <w:bottom w:w="70" w:type="dxa"/>
+              <w:end w:w="80" w:type="dxa"/>
+            </w:tcMar>
+          </w:tcPr>
+          <w:p>
+            <w:pPr>
+              <w:spacing w:after="0" w:line="269" w:lineRule="auto"/>
+              <w:jc w:val="center"/>
+            </w:pPr>
+            <w:r/>
+            <w:r>
+              <w:rPr>
+                <w:rFonts w:ascii="S-Core Dream" w:hAnsi="S-Core Dream" w:eastAsia="에스코어 드림"/>
+                <w:b w:val="0"/>
+                <w:color w:val="233A3E"/>
+                <w:sz w:val="14"/>
+              </w:rPr>
+              <w:t>3</w:t>
+            </w:r>
+          </w:p>
+        </w:tc>
+        <w:tc>
+          <w:tcPr>
+            <w:tcW w:type="dxa" w:w="6746"/>
+            <w:vAlign w:val="center"/>
+            <w:tcMar>
+              <w:top w:w="70" w:type="dxa"/>
+              <w:start w:w="80" w:type="dxa"/>
+              <w:bottom w:w="70" w:type="dxa"/>
+              <w:end w:w="80" w:type="dxa"/>
+            </w:tcMar>
+          </w:tcPr>
+          <w:p>
+            <w:pPr>
+              <w:spacing w:after="0" w:line="269" w:lineRule="auto"/>
+              <w:jc w:val="left"/>
+            </w:pPr>
+            <w:r/>
+            <w:r>
+              <w:rPr>
+                <w:rFonts w:ascii="S-Core Dream" w:hAnsi="S-Core Dream" w:eastAsia="에스코어 드림"/>
+                <w:b w:val="0"/>
+                <w:color w:val="233A3E"/>
+                <w:sz w:val="15"/>
+              </w:rPr>
+              <w:t>얼굴을 알아보고 잠금 풀기</w:t>
+            </w:r>
+          </w:p>
+        </w:tc>
+        <w:tc>
+          <w:tcPr>
+            <w:tcW w:type="dxa" w:w="2665"/>
+            <w:vAlign w:val="center"/>
+            <w:tcMar>
+              <w:top w:w="70" w:type="dxa"/>
+              <w:start w:w="80" w:type="dxa"/>
+              <w:bottom w:w="70" w:type="dxa"/>
+              <w:end w:w="80" w:type="dxa"/>
+            </w:tcMar>
+          </w:tcPr>
+          <w:p>
+            <w:pPr>
+              <w:spacing w:after="0" w:line="269" w:lineRule="auto"/>
+              <w:jc w:val="center"/>
+            </w:pPr>
+            <w:r/>
+            <w:r>
+              <w:rPr>
+                <w:rFonts w:ascii="S-Core Dream" w:hAnsi="S-Core Dream" w:eastAsia="에스코어 드림"/>
+                <w:b w:val="0"/>
+                <w:color w:val="154541"/>
+                <w:sz w:val="14"/>
+              </w:rPr>
+              <w:t>________________</w:t>
+            </w:r>
+          </w:p>
+        </w:tc>
+      </w:tr>
+      <w:tr>
+        <w:trPr>
+          <w:trHeight w:val="414" w:hRule="exact"/>
+        </w:trPr>
+        <w:tc>
+          <w:tcPr>
+            <w:tcW w:type="dxa" w:w="907"/>
+            <w:vAlign w:val="center"/>
+            <w:tcMar>
+              <w:top w:w="70" w:type="dxa"/>
+              <w:start w:w="80" w:type="dxa"/>
+              <w:bottom w:w="70" w:type="dxa"/>
+              <w:end w:w="80" w:type="dxa"/>
+            </w:tcMar>
+            <w:shd w:fill="FFFDF7"/>
+          </w:tcPr>
+          <w:p>
+            <w:pPr>
+              <w:spacing w:after="0" w:line="269" w:lineRule="auto"/>
+              <w:jc w:val="center"/>
+            </w:pPr>
+            <w:r/>
+            <w:r>
+              <w:rPr>
+                <w:rFonts w:ascii="S-Core Dream" w:hAnsi="S-Core Dream" w:eastAsia="에스코어 드림"/>
+                <w:b w:val="0"/>
+                <w:color w:val="233A3E"/>
+                <w:sz w:val="14"/>
+              </w:rPr>
+              <w:t>4</w:t>
+            </w:r>
+          </w:p>
+        </w:tc>
+        <w:tc>
+          <w:tcPr>
+            <w:tcW w:type="dxa" w:w="6746"/>
+            <w:vAlign w:val="center"/>
+            <w:tcMar>
+              <w:top w:w="70" w:type="dxa"/>
+              <w:start w:w="80" w:type="dxa"/>
+              <w:bottom w:w="70" w:type="dxa"/>
+              <w:end w:w="80" w:type="dxa"/>
+            </w:tcMar>
+            <w:shd w:fill="FFFDF7"/>
+          </w:tcPr>
+          <w:p>
+            <w:pPr>
+              <w:spacing w:after="0" w:line="269" w:lineRule="auto"/>
+              <w:jc w:val="left"/>
+            </w:pPr>
+            <w:r/>
+            <w:r>
+              <w:rPr>
+                <w:rFonts w:ascii="S-Core Dream" w:hAnsi="S-Core Dream" w:eastAsia="에스코어 드림"/>
+                <w:b w:val="0"/>
+                <w:color w:val="233A3E"/>
+                <w:sz w:val="15"/>
+              </w:rPr>
+              <w:t>말소리를 글자로 바꾸기</w:t>
+            </w:r>
+          </w:p>
+        </w:tc>
+        <w:tc>
+          <w:tcPr>
+            <w:tcW w:type="dxa" w:w="2665"/>
+            <w:vAlign w:val="center"/>
+            <w:tcMar>
+              <w:top w:w="70" w:type="dxa"/>
+              <w:start w:w="80" w:type="dxa"/>
+              <w:bottom w:w="70" w:type="dxa"/>
+              <w:end w:w="80" w:type="dxa"/>
+            </w:tcMar>
+            <w:shd w:fill="FFFDF7"/>
+          </w:tcPr>
+          <w:p>
+            <w:pPr>
+              <w:spacing w:after="0" w:line="269" w:lineRule="auto"/>
+              <w:jc w:val="center"/>
+            </w:pPr>
+            <w:r/>
+            <w:r>
+              <w:rPr>
+                <w:rFonts w:ascii="S-Core Dream" w:hAnsi="S-Core Dream" w:eastAsia="에스코어 드림"/>
+                <w:b w:val="0"/>
+                <w:color w:val="154541"/>
+                <w:sz w:val="14"/>
+              </w:rPr>
+              <w:t>________________</w:t>
+            </w:r>
+          </w:p>
+        </w:tc>
+      </w:tr>
+      <w:tr>
+        <w:trPr>
+          <w:trHeight w:val="414" w:hRule="exact"/>
+        </w:trPr>
+        <w:tc>
+          <w:tcPr>
+            <w:tcW w:type="dxa" w:w="907"/>
+            <w:vAlign w:val="center"/>
+            <w:tcMar>
+              <w:top w:w="70" w:type="dxa"/>
+              <w:start w:w="80" w:type="dxa"/>
+              <w:bottom w:w="70" w:type="dxa"/>
+              <w:end w:w="80" w:type="dxa"/>
+            </w:tcMar>
+          </w:tcPr>
+          <w:p>
+            <w:pPr>
+              <w:spacing w:after="0" w:line="269" w:lineRule="auto"/>
+              <w:jc w:val="center"/>
+            </w:pPr>
+            <w:r/>
+            <w:r>
+              <w:rPr>
+                <w:rFonts w:ascii="S-Core Dream" w:hAnsi="S-Core Dream" w:eastAsia="에스코어 드림"/>
+                <w:b w:val="0"/>
+                <w:color w:val="233A3E"/>
+                <w:sz w:val="14"/>
+              </w:rPr>
+              <w:t>5</w:t>
+            </w:r>
+          </w:p>
+        </w:tc>
+        <w:tc>
+          <w:tcPr>
+            <w:tcW w:type="dxa" w:w="6746"/>
+            <w:vAlign w:val="center"/>
+            <w:tcMar>
+              <w:top w:w="70" w:type="dxa"/>
+              <w:start w:w="80" w:type="dxa"/>
+              <w:bottom w:w="70" w:type="dxa"/>
+              <w:end w:w="80" w:type="dxa"/>
+            </w:tcMar>
+          </w:tcPr>
+          <w:p>
+            <w:pPr>
+              <w:spacing w:after="0" w:line="269" w:lineRule="auto"/>
+              <w:jc w:val="left"/>
+            </w:pPr>
+            <w:r/>
+            <w:r>
+              <w:rPr>
+                <w:rFonts w:ascii="S-Core Dream" w:hAnsi="S-Core Dream" w:eastAsia="에스코어 드림"/>
+                <w:b w:val="0"/>
+                <w:color w:val="233A3E"/>
+                <w:sz w:val="15"/>
+              </w:rPr>
+              <w:t>사진을 동물·식물로 나누기</w:t>
+            </w:r>
+          </w:p>
+        </w:tc>
+        <w:tc>
+          <w:tcPr>
+            <w:tcW w:type="dxa" w:w="2665"/>
+            <w:vAlign w:val="center"/>
+            <w:tcMar>
+              <w:top w:w="70" w:type="dxa"/>
+              <w:start w:w="80" w:type="dxa"/>
+              <w:bottom w:w="70" w:type="dxa"/>
+              <w:end w:w="80" w:type="dxa"/>
+            </w:tcMar>
+          </w:tcPr>
+          <w:p>
+            <w:pPr>
+              <w:spacing w:after="0" w:line="269" w:lineRule="auto"/>
+              <w:jc w:val="center"/>
+            </w:pPr>
+            <w:r/>
+            <w:r>
+              <w:rPr>
+                <w:rFonts w:ascii="S-Core Dream" w:hAnsi="S-Core Dream" w:eastAsia="에스코어 드림"/>
+                <w:b w:val="0"/>
+                <w:color w:val="154541"/>
+                <w:sz w:val="14"/>
+              </w:rPr>
+              <w:t>________________</w:t>
+            </w:r>
+          </w:p>
+        </w:tc>
+      </w:tr>
+      <w:tr>
+        <w:trPr>
+          <w:trHeight w:val="414" w:hRule="exact"/>
+        </w:trPr>
+        <w:tc>
+          <w:tcPr>
+            <w:tcW w:type="dxa" w:w="907"/>
+            <w:vAlign w:val="center"/>
+            <w:tcMar>
+              <w:top w:w="70" w:type="dxa"/>
+              <w:start w:w="80" w:type="dxa"/>
+              <w:bottom w:w="70" w:type="dxa"/>
+              <w:end w:w="80" w:type="dxa"/>
+            </w:tcMar>
+            <w:shd w:fill="FFFDF7"/>
+          </w:tcPr>
+          <w:p>
+            <w:pPr>
+              <w:spacing w:after="0" w:line="269" w:lineRule="auto"/>
+              <w:jc w:val="center"/>
+            </w:pPr>
+            <w:r/>
+            <w:r>
+              <w:rPr>
+                <w:rFonts w:ascii="S-Core Dream" w:hAnsi="S-Core Dream" w:eastAsia="에스코어 드림"/>
+                <w:b w:val="0"/>
+                <w:color w:val="233A3E"/>
+                <w:sz w:val="14"/>
+              </w:rPr>
+              <w:t>6</w:t>
+            </w:r>
+          </w:p>
+        </w:tc>
+        <w:tc>
+          <w:tcPr>
+            <w:tcW w:type="dxa" w:w="6746"/>
+            <w:vAlign w:val="center"/>
+            <w:tcMar>
+              <w:top w:w="70" w:type="dxa"/>
+              <w:start w:w="80" w:type="dxa"/>
+              <w:bottom w:w="70" w:type="dxa"/>
+              <w:end w:w="80" w:type="dxa"/>
+            </w:tcMar>
+            <w:shd w:fill="FFFDF7"/>
+          </w:tcPr>
+          <w:p>
+            <w:pPr>
+              <w:spacing w:after="0" w:line="269" w:lineRule="auto"/>
+              <w:jc w:val="left"/>
+            </w:pPr>
+            <w:r/>
+            <w:r>
+              <w:rPr>
+                <w:rFonts w:ascii="S-Core Dream" w:hAnsi="S-Core Dream" w:eastAsia="에스코어 드림"/>
+                <w:b w:val="0"/>
+                <w:color w:val="233A3E"/>
+                <w:sz w:val="15"/>
+              </w:rPr>
+              <w:t>스팸 메일 가려내기</w:t>
+            </w:r>
+          </w:p>
+        </w:tc>
+        <w:tc>
+          <w:tcPr>
+            <w:tcW w:type="dxa" w:w="2665"/>
+            <w:vAlign w:val="center"/>
+            <w:tcMar>
+              <w:top w:w="70" w:type="dxa"/>
+              <w:start w:w="80" w:type="dxa"/>
+              <w:bottom w:w="70" w:type="dxa"/>
+              <w:end w:w="80" w:type="dxa"/>
+            </w:tcMar>
+            <w:shd w:fill="FFFDF7"/>
+          </w:tcPr>
+          <w:p>
+            <w:pPr>
+              <w:spacing w:after="0" w:line="269" w:lineRule="auto"/>
+              <w:jc w:val="center"/>
+            </w:pPr>
+            <w:r/>
+            <w:r>
+              <w:rPr>
+                <w:rFonts w:ascii="S-Core Dream" w:hAnsi="S-Core Dream" w:eastAsia="에스코어 드림"/>
+                <w:b w:val="0"/>
+                <w:color w:val="154541"/>
+                <w:sz w:val="14"/>
+              </w:rPr>
+              <w:t>________________</w:t>
+            </w:r>
+          </w:p>
+        </w:tc>
+      </w:tr>
+      <w:tr>
+        <w:trPr>
+          <w:trHeight w:val="414" w:hRule="exact"/>
+        </w:trPr>
+        <w:tc>
+          <w:tcPr>
+            <w:tcW w:type="dxa" w:w="907"/>
+            <w:vAlign w:val="center"/>
+            <w:tcMar>
+              <w:top w:w="70" w:type="dxa"/>
+              <w:start w:w="80" w:type="dxa"/>
+              <w:bottom w:w="70" w:type="dxa"/>
+              <w:end w:w="80" w:type="dxa"/>
+            </w:tcMar>
+          </w:tcPr>
+          <w:p>
+            <w:pPr>
+              <w:spacing w:after="0" w:line="269" w:lineRule="auto"/>
+              <w:jc w:val="center"/>
+            </w:pPr>
+            <w:r/>
+            <w:r>
+              <w:rPr>
+                <w:rFonts w:ascii="S-Core Dream" w:hAnsi="S-Core Dream" w:eastAsia="에스코어 드림"/>
+                <w:b w:val="0"/>
+                <w:color w:val="233A3E"/>
+                <w:sz w:val="14"/>
+              </w:rPr>
+              <w:t>7</w:t>
+            </w:r>
+          </w:p>
+        </w:tc>
+        <w:tc>
+          <w:tcPr>
+            <w:tcW w:type="dxa" w:w="6746"/>
+            <w:vAlign w:val="center"/>
+            <w:tcMar>
+              <w:top w:w="70" w:type="dxa"/>
+              <w:start w:w="80" w:type="dxa"/>
+              <w:bottom w:w="70" w:type="dxa"/>
+              <w:end w:w="80" w:type="dxa"/>
+            </w:tcMar>
+          </w:tcPr>
+          <w:p>
+            <w:pPr>
+              <w:spacing w:after="0" w:line="269" w:lineRule="auto"/>
+              <w:jc w:val="left"/>
+            </w:pPr>
+            <w:r/>
+            <w:r>
+              <w:rPr>
+                <w:rFonts w:ascii="S-Core Dream" w:hAnsi="S-Core Dream" w:eastAsia="에스코어 드림"/>
+                <w:b w:val="0"/>
+                <w:color w:val="233A3E"/>
+                <w:sz w:val="15"/>
+              </w:rPr>
+              <w:t>10분 뒤 알람 울리기</w:t>
+            </w:r>
+          </w:p>
+        </w:tc>
+        <w:tc>
+          <w:tcPr>
+            <w:tcW w:type="dxa" w:w="2665"/>
+            <w:vAlign w:val="center"/>
+            <w:tcMar>
+              <w:top w:w="70" w:type="dxa"/>
+              <w:start w:w="80" w:type="dxa"/>
+              <w:bottom w:w="70" w:type="dxa"/>
+              <w:end w:w="80" w:type="dxa"/>
+            </w:tcMar>
+          </w:tcPr>
+          <w:p>
+            <w:pPr>
+              <w:spacing w:after="0" w:line="269" w:lineRule="auto"/>
+              <w:jc w:val="center"/>
+            </w:pPr>
+            <w:r/>
+            <w:r>
+              <w:rPr>
+                <w:rFonts w:ascii="S-Core Dream" w:hAnsi="S-Core Dream" w:eastAsia="에스코어 드림"/>
+                <w:b w:val="0"/>
+                <w:color w:val="154541"/>
+                <w:sz w:val="14"/>
+              </w:rPr>
+              <w:t>________________</w:t>
+            </w:r>
+          </w:p>
+        </w:tc>
+      </w:tr>
+      <w:tr>
+        <w:trPr>
+          <w:trHeight w:val="414" w:hRule="exact"/>
+        </w:trPr>
+        <w:tc>
+          <w:tcPr>
+            <w:tcW w:type="dxa" w:w="907"/>
+            <w:vAlign w:val="center"/>
+            <w:tcMar>
+              <w:top w:w="70" w:type="dxa"/>
+              <w:start w:w="80" w:type="dxa"/>
+              <w:bottom w:w="70" w:type="dxa"/>
+              <w:end w:w="80" w:type="dxa"/>
+            </w:tcMar>
+            <w:shd w:fill="FFFDF7"/>
+          </w:tcPr>
+          <w:p>
+            <w:pPr>
+              <w:spacing w:after="0" w:line="269" w:lineRule="auto"/>
+              <w:jc w:val="center"/>
+            </w:pPr>
+            <w:r/>
+            <w:r>
+              <w:rPr>
+                <w:rFonts w:ascii="S-Core Dream" w:hAnsi="S-Core Dream" w:eastAsia="에스코어 드림"/>
+                <w:b w:val="0"/>
+                <w:color w:val="233A3E"/>
+                <w:sz w:val="14"/>
+              </w:rPr>
+              <w:t>8</w:t>
+            </w:r>
+          </w:p>
+        </w:tc>
+        <w:tc>
+          <w:tcPr>
+            <w:tcW w:type="dxa" w:w="6746"/>
+            <w:vAlign w:val="center"/>
+            <w:tcMar>
+              <w:top w:w="70" w:type="dxa"/>
+              <w:start w:w="80" w:type="dxa"/>
+              <w:bottom w:w="70" w:type="dxa"/>
+              <w:end w:w="80" w:type="dxa"/>
+            </w:tcMar>
+            <w:shd w:fill="FFFDF7"/>
+          </w:tcPr>
+          <w:p>
+            <w:pPr>
+              <w:spacing w:after="0" w:line="269" w:lineRule="auto"/>
+              <w:jc w:val="left"/>
+            </w:pPr>
+            <w:r/>
+            <w:r>
+              <w:rPr>
+                <w:rFonts w:ascii="S-Core Dream" w:hAnsi="S-Core Dream" w:eastAsia="에스코어 드림"/>
+                <w:b w:val="0"/>
+                <w:color w:val="233A3E"/>
+                <w:sz w:val="15"/>
+              </w:rPr>
+              <w:t>센서 자동문 열기</w:t>
+            </w:r>
+          </w:p>
+        </w:tc>
+        <w:tc>
+          <w:tcPr>
+            <w:tcW w:type="dxa" w:w="2665"/>
+            <w:vAlign w:val="center"/>
+            <w:tcMar>
+              <w:top w:w="70" w:type="dxa"/>
+              <w:start w:w="80" w:type="dxa"/>
+              <w:bottom w:w="70" w:type="dxa"/>
+              <w:end w:w="80" w:type="dxa"/>
+            </w:tcMar>
+            <w:shd w:fill="FFFDF7"/>
+          </w:tcPr>
+          <w:p>
+            <w:pPr>
+              <w:spacing w:after="0" w:line="269" w:lineRule="auto"/>
+              <w:jc w:val="center"/>
+            </w:pPr>
+            <w:r/>
+            <w:r>
+              <w:rPr>
+                <w:rFonts w:ascii="S-Core Dream" w:hAnsi="S-Core Dream" w:eastAsia="에스코어 드림"/>
+                <w:b w:val="0"/>
+                <w:color w:val="154541"/>
+                <w:sz w:val="14"/>
+              </w:rPr>
+              <w:t>________________</w:t>
             </w:r>
           </w:p>
         </w:tc>
@@ -458,7 +1018,7 @@
           <w:color w:val="1F5D59"/>
           <w:sz w:val="18"/>
         </w:rPr>
-        <w:t xml:space="preserve">3  </w:t>
+        <w:t xml:space="preserve">2  </w:t>
       </w:r>
       <w:r>
         <w:rPr>
@@ -467,7 +1027,7 @@
           <w:color w:val="233A3E"/>
           <w:sz w:val="18"/>
         </w:rPr>
-        <w:t>내가 상상한 그림과 AI 그림을 비교해 쓰세요.</w:t>
+        <w:t>AI와 자동 기계를 구별한 까닭을 한 가지씩 쓰세요.</w:t>
       </w:r>
     </w:p>
     <w:tbl>
@@ -516,7 +1076,7 @@
                 <w:color w:val="154541"/>
                 <w:sz w:val="15"/>
               </w:rPr>
-              <w:t>같았던 점</w:t>
+              <w:t>AI 장면과 까닭</w:t>
             </w:r>
           </w:p>
         </w:tc>
@@ -545,14 +1105,14 @@
                 <w:color w:val="154541"/>
                 <w:sz w:val="15"/>
               </w:rPr>
-              <w:t>달랐던 점</w:t>
+              <w:t>자동 기계 장면과 까닭</w:t>
             </w:r>
           </w:p>
         </w:tc>
       </w:tr>
       <w:tr>
         <w:trPr>
-          <w:trHeight w:val="1134" w:hRule="exact"/>
+          <w:trHeight w:val="1361" w:hRule="exact"/>
         </w:trPr>
         <w:tc>
           <w:tcPr>
@@ -623,7 +1183,7 @@
           <w:color w:val="1F5D59"/>
           <w:sz w:val="18"/>
         </w:rPr>
-        <w:t xml:space="preserve">4  </w:t>
+        <w:t xml:space="preserve">3  </w:t>
       </w:r>
       <w:r>
         <w:rPr>
@@ -653,7 +1213,7 @@
       </w:tblGrid>
       <w:tr>
         <w:trPr>
-          <w:trHeight w:val="737" w:hRule="exact"/>
+          <w:trHeight w:val="1077" w:hRule="exact"/>
         </w:trPr>
         <w:tc>
           <w:tcPr>
@@ -680,7 +1240,9 @@
                 <w:color w:val="233A3E"/>
                 <w:sz w:val="16"/>
               </w:rPr>
-              <w:t>사람은  ____________________  을 바탕으로 생각하고, AI는  ____________________  을 바탕으로 결과를 만듭니다.</w:t>
+              <w:t>자동 기계는  ____________________  에 따라 움직이고,</w:t>
+              <w:br/>
+              <w:t>AI는 데이터에서  ____________________  을 찾아 추천·인식·분류합니다.</w:t>
             </w:r>
           </w:p>
         </w:tc>
@@ -697,7 +1259,7 @@
           <w:color w:val="1F5D59"/>
           <w:sz w:val="18"/>
         </w:rPr>
-        <w:t xml:space="preserve">5  </w:t>
+        <w:t xml:space="preserve">4  </w:t>
       </w:r>
       <w:r>
         <w:rPr>
@@ -727,7 +1289,7 @@
       </w:tblGrid>
       <w:tr>
         <w:trPr>
-          <w:trHeight w:val="907" w:hRule="exact"/>
+          <w:trHeight w:val="1247" w:hRule="exact"/>
         </w:trPr>
         <w:tc>
           <w:tcPr>

</xml_diff>

<commit_message>
fix: simplify lesson 01 for younger learners
</commit_message>
<xml_diff>
--- a/public/resources/lesson-01/02_1차시_학생활동지.docx
+++ b/public/resources/lesson-01/02_1차시_학생활동지.docx
@@ -18,13 +18,13 @@
         </w:tblBorders>
       </w:tblPr>
       <w:tblGrid>
-        <w:gridCol w:w="5329"/>
-        <w:gridCol w:w="5329"/>
+        <w:gridCol w:w="5386"/>
+        <w:gridCol w:w="5386"/>
       </w:tblGrid>
       <w:tr>
         <w:tc>
           <w:tcPr>
-            <w:tcW w:type="dxa" w:w="7767"/>
+            <w:tcW w:type="dxa" w:w="7937"/>
           </w:tcPr>
           <w:p>
             <w:r/>
@@ -60,13 +60,13 @@
                 <w:color w:val="647779"/>
                 <w:sz w:val="14"/>
               </w:rPr>
-              <w:t>AI와 함께 만드는 우리 옛이야기 그림책 · 1차시</w:t>
+              <w:t>우리 생활 속 AI를 찾아보는 1차시</w:t>
             </w:r>
           </w:p>
         </w:tc>
         <w:tc>
           <w:tcPr>
-            <w:tcW w:type="dxa" w:w="2551"/>
+            <w:tcW w:type="dxa" w:w="2835"/>
             <w:vAlign w:val="center"/>
             <w:tcMar>
               <w:top w:w="70" w:type="dxa"/>
@@ -108,7 +108,7 @@
           <w:rFonts w:ascii="S-Core Dream" w:hAnsi="S-Core Dream" w:eastAsia="에스코어 드림"/>
           <w:b/>
           <w:color w:val="1F5D59"/>
-          <w:sz w:val="18"/>
+          <w:sz w:val="20"/>
         </w:rPr>
         <w:t xml:space="preserve">1  </w:t>
       </w:r>
@@ -117,31 +117,41 @@
           <w:rFonts w:ascii="S-Core Dream" w:hAnsi="S-Core Dream" w:eastAsia="에스코어 드림"/>
           <w:b/>
           <w:color w:val="233A3E"/>
-          <w:sz w:val="18"/>
+          <w:sz w:val="20"/>
         </w:rPr>
-        <w:t>각 사례를 보고 알맞은 기능을 써 보세요.</w:t>
+        <w:t>알맞은 칸에 ○표하세요.</w:t>
       </w:r>
     </w:p>
     <w:tbl>
       <w:tblPr>
         <w:tblW w:type="auto" w:w="0"/>
+        <w:jc w:val="center"/>
+        <w:tblLayout w:type="fixed"/>
         <w:tblLook w:firstColumn="1" w:firstRow="1" w:lastColumn="0" w:lastRow="0" w:noHBand="0" w:noVBand="1" w:val="04A0"/>
         <w:tblBorders>
-          <w:top w:val="single" w:sz="6" w:space="0" w:color="1F5D59"/>
-          <w:left w:val="single" w:sz="6" w:space="0" w:color="1F5D59"/>
-          <w:bottom w:val="single" w:sz="6" w:space="0" w:color="1F5D59"/>
-          <w:right w:val="single" w:sz="6" w:space="0" w:color="1F5D59"/>
-          <w:insideH w:val="single" w:sz="6" w:space="0" w:color="1F5D59"/>
-          <w:insideV w:val="single" w:sz="6" w:space="0" w:color="1F5D59"/>
+          <w:top w:val="single" w:sz="5" w:space="0" w:color="AFC0B9"/>
+          <w:left w:val="single" w:sz="5" w:space="0" w:color="AFC0B9"/>
+          <w:bottom w:val="single" w:sz="5" w:space="0" w:color="AFC0B9"/>
+          <w:right w:val="single" w:sz="5" w:space="0" w:color="AFC0B9"/>
+          <w:insideH w:val="single" w:sz="5" w:space="0" w:color="AFC0B9"/>
+          <w:insideV w:val="single" w:sz="5" w:space="0" w:color="AFC0B9"/>
         </w:tblBorders>
       </w:tblPr>
       <w:tblGrid>
-        <w:gridCol w:w="10658"/>
+        <w:gridCol w:w="737"/>
+        <w:gridCol w:w="5046"/>
+        <w:gridCol w:w="1247"/>
+        <w:gridCol w:w="1247"/>
+        <w:gridCol w:w="1247"/>
+        <w:gridCol w:w="1247"/>
       </w:tblGrid>
       <w:tr>
+        <w:trPr>
+          <w:trHeight w:val="567" w:hRule="atLeast"/>
+        </w:trPr>
         <w:tc>
           <w:tcPr>
-            <w:tcW w:type="dxa" w:w="10658"/>
+            <w:tcW w:type="dxa" w:w="737"/>
             <w:vAlign w:val="center"/>
             <w:tcMar>
               <w:top w:w="70" w:type="dxa"/>
@@ -164,39 +174,13 @@
                 <w:color w:val="154541"/>
                 <w:sz w:val="16"/>
               </w:rPr>
-              <w:t>보기   추천  ·  인식  ·  분류  ·  자동 기계</w:t>
+              <w:t>번호</w:t>
             </w:r>
           </w:p>
         </w:tc>
-      </w:tr>
-    </w:tbl>
-    <w:tbl>
-      <w:tblPr>
-        <w:tblW w:type="auto" w:w="0"/>
-        <w:jc w:val="center"/>
-        <w:tblLayout w:type="fixed"/>
-        <w:tblLook w:firstColumn="1" w:firstRow="1" w:lastColumn="0" w:lastRow="0" w:noHBand="0" w:noVBand="1" w:val="04A0"/>
-        <w:tblBorders>
-          <w:top w:val="single" w:sz="5" w:space="0" w:color="AFC0B9"/>
-          <w:left w:val="single" w:sz="5" w:space="0" w:color="AFC0B9"/>
-          <w:bottom w:val="single" w:sz="5" w:space="0" w:color="AFC0B9"/>
-          <w:right w:val="single" w:sz="5" w:space="0" w:color="AFC0B9"/>
-          <w:insideH w:val="single" w:sz="5" w:space="0" w:color="AFC0B9"/>
-          <w:insideV w:val="single" w:sz="5" w:space="0" w:color="AFC0B9"/>
-        </w:tblBorders>
-      </w:tblPr>
-      <w:tblGrid>
-        <w:gridCol w:w="907"/>
-        <w:gridCol w:w="6746"/>
-        <w:gridCol w:w="2665"/>
-      </w:tblGrid>
-      <w:tr>
-        <w:trPr>
-          <w:trHeight w:val="414" w:hRule="exact"/>
-        </w:trPr>
         <w:tc>
           <w:tcPr>
-            <w:tcW w:type="dxa" w:w="907"/>
+            <w:tcW w:type="dxa" w:w="5046"/>
             <w:vAlign w:val="center"/>
             <w:tcMar>
               <w:top w:w="70" w:type="dxa"/>
@@ -217,15 +201,15 @@
                 <w:rFonts w:ascii="S-Core Dream" w:hAnsi="S-Core Dream" w:eastAsia="에스코어 드림"/>
                 <w:b/>
                 <w:color w:val="154541"/>
-                <w:sz w:val="15"/>
+                <w:sz w:val="16"/>
               </w:rPr>
-              <w:t>번호</w:t>
+              <w:t>무엇을 하나요?</w:t>
             </w:r>
           </w:p>
         </w:tc>
         <w:tc>
           <w:tcPr>
-            <w:tcW w:type="dxa" w:w="6746"/>
+            <w:tcW w:type="dxa" w:w="1247"/>
             <w:vAlign w:val="center"/>
             <w:tcMar>
               <w:top w:w="70" w:type="dxa"/>
@@ -246,15 +230,15 @@
                 <w:rFonts w:ascii="S-Core Dream" w:hAnsi="S-Core Dream" w:eastAsia="에스코어 드림"/>
                 <w:b/>
                 <w:color w:val="154541"/>
-                <w:sz w:val="15"/>
+                <w:sz w:val="16"/>
               </w:rPr>
-              <w:t>사례</w:t>
+              <w:t>추천</w:t>
             </w:r>
           </w:p>
         </w:tc>
         <w:tc>
           <w:tcPr>
-            <w:tcW w:type="dxa" w:w="2665"/>
+            <w:tcW w:type="dxa" w:w="1247"/>
             <w:vAlign w:val="center"/>
             <w:tcMar>
               <w:top w:w="70" w:type="dxa"/>
@@ -275,20 +259,134 @@
                 <w:rFonts w:ascii="S-Core Dream" w:hAnsi="S-Core Dream" w:eastAsia="에스코어 드림"/>
                 <w:b/>
                 <w:color w:val="154541"/>
-                <w:sz w:val="15"/>
+                <w:sz w:val="16"/>
               </w:rPr>
-              <w:t>기능</w:t>
+              <w:t>인식</w:t>
+            </w:r>
+          </w:p>
+        </w:tc>
+        <w:tc>
+          <w:tcPr>
+            <w:tcW w:type="dxa" w:w="1247"/>
+            <w:vAlign w:val="center"/>
+            <w:tcMar>
+              <w:top w:w="70" w:type="dxa"/>
+              <w:start w:w="80" w:type="dxa"/>
+              <w:bottom w:w="70" w:type="dxa"/>
+              <w:end w:w="80" w:type="dxa"/>
+            </w:tcMar>
+            <w:shd w:fill="E4EFEA"/>
+          </w:tcPr>
+          <w:p>
+            <w:pPr>
+              <w:spacing w:after="0" w:line="269" w:lineRule="auto"/>
+              <w:jc w:val="center"/>
+            </w:pPr>
+            <w:r/>
+            <w:r>
+              <w:rPr>
+                <w:rFonts w:ascii="S-Core Dream" w:hAnsi="S-Core Dream" w:eastAsia="에스코어 드림"/>
+                <w:b/>
+                <w:color w:val="154541"/>
+                <w:sz w:val="16"/>
+              </w:rPr>
+              <w:t>분류</w:t>
+            </w:r>
+          </w:p>
+        </w:tc>
+        <w:tc>
+          <w:tcPr>
+            <w:tcW w:type="dxa" w:w="1247"/>
+            <w:vAlign w:val="center"/>
+            <w:tcMar>
+              <w:top w:w="70" w:type="dxa"/>
+              <w:start w:w="80" w:type="dxa"/>
+              <w:bottom w:w="70" w:type="dxa"/>
+              <w:end w:w="80" w:type="dxa"/>
+            </w:tcMar>
+            <w:shd w:fill="E4EFEA"/>
+          </w:tcPr>
+          <w:p>
+            <w:pPr>
+              <w:spacing w:after="0" w:line="269" w:lineRule="auto"/>
+              <w:jc w:val="center"/>
+            </w:pPr>
+            <w:r/>
+            <w:r>
+              <w:rPr>
+                <w:rFonts w:ascii="S-Core Dream" w:hAnsi="S-Core Dream" w:eastAsia="에스코어 드림"/>
+                <w:b/>
+                <w:color w:val="154541"/>
+                <w:sz w:val="16"/>
+              </w:rPr>
+              <w:t>자동기계</w:t>
             </w:r>
           </w:p>
         </w:tc>
       </w:tr>
       <w:tr>
         <w:trPr>
-          <w:trHeight w:val="414" w:hRule="exact"/>
+          <w:trHeight w:val="493" w:hRule="atLeast"/>
         </w:trPr>
         <w:tc>
           <w:tcPr>
-            <w:tcW w:type="dxa" w:w="907"/>
+            <w:tcW w:type="dxa" w:w="737"/>
+            <w:vAlign w:val="center"/>
+            <w:tcMar>
+              <w:top w:w="70" w:type="dxa"/>
+              <w:start w:w="80" w:type="dxa"/>
+              <w:bottom w:w="70" w:type="dxa"/>
+              <w:end w:w="80" w:type="dxa"/>
+            </w:tcMar>
+          </w:tcPr>
+          <w:p>
+            <w:pPr>
+              <w:spacing w:after="0" w:line="269" w:lineRule="auto"/>
+              <w:jc w:val="center"/>
+            </w:pPr>
+            <w:r/>
+            <w:r>
+              <w:rPr>
+                <w:rFonts w:ascii="S-Core Dream" w:hAnsi="S-Core Dream" w:eastAsia="에스코어 드림"/>
+                <w:b/>
+                <w:color w:val="1F5D59"/>
+                <w:sz w:val="17"/>
+              </w:rPr>
+              <w:t>1</w:t>
+            </w:r>
+          </w:p>
+        </w:tc>
+        <w:tc>
+          <w:tcPr>
+            <w:tcW w:type="dxa" w:w="5046"/>
+            <w:vAlign w:val="center"/>
+            <w:tcMar>
+              <w:top w:w="70" w:type="dxa"/>
+              <w:start w:w="80" w:type="dxa"/>
+              <w:bottom w:w="70" w:type="dxa"/>
+              <w:end w:w="80" w:type="dxa"/>
+            </w:tcMar>
+          </w:tcPr>
+          <w:p>
+            <w:pPr>
+              <w:spacing w:after="0" w:line="269" w:lineRule="auto"/>
+              <w:jc w:val="left"/>
+            </w:pPr>
+            <w:r/>
+            <w:r>
+              <w:rPr>
+                <w:rFonts w:ascii="S-Core Dream" w:hAnsi="S-Core Dream" w:eastAsia="에스코어 드림"/>
+                <w:b w:val="0"/>
+                <w:color w:val="233A3E"/>
+                <w:sz w:val="18"/>
+              </w:rPr>
+              <w:t>좋아할 영상 골라 주기</w:t>
+            </w:r>
+          </w:p>
+        </w:tc>
+        <w:tc>
+          <w:tcPr>
+            <w:tcW w:type="dxa" w:w="1247"/>
             <w:vAlign w:val="center"/>
             <w:tcMar>
               <w:top w:w="70" w:type="dxa"/>
@@ -308,43 +406,14 @@
                 <w:rFonts w:ascii="S-Core Dream" w:hAnsi="S-Core Dream" w:eastAsia="에스코어 드림"/>
                 <w:b w:val="0"/>
                 <w:color w:val="233A3E"/>
-                <w:sz w:val="14"/>
+                <w:sz w:val="18"/>
               </w:rPr>
-              <w:t>1</w:t>
             </w:r>
           </w:p>
         </w:tc>
         <w:tc>
           <w:tcPr>
-            <w:tcW w:type="dxa" w:w="6746"/>
-            <w:vAlign w:val="center"/>
-            <w:tcMar>
-              <w:top w:w="70" w:type="dxa"/>
-              <w:start w:w="80" w:type="dxa"/>
-              <w:bottom w:w="70" w:type="dxa"/>
-              <w:end w:w="80" w:type="dxa"/>
-            </w:tcMar>
-          </w:tcPr>
-          <w:p>
-            <w:pPr>
-              <w:spacing w:after="0" w:line="269" w:lineRule="auto"/>
-              <w:jc w:val="left"/>
-            </w:pPr>
-            <w:r/>
-            <w:r>
-              <w:rPr>
-                <w:rFonts w:ascii="S-Core Dream" w:hAnsi="S-Core Dream" w:eastAsia="에스코어 드림"/>
-                <w:b w:val="0"/>
-                <w:color w:val="233A3E"/>
-                <w:sz w:val="15"/>
-              </w:rPr>
-              <w:t>좋아할 영상 골라 주기</w:t>
-            </w:r>
-          </w:p>
-        </w:tc>
-        <w:tc>
-          <w:tcPr>
-            <w:tcW w:type="dxa" w:w="2665"/>
+            <w:tcW w:type="dxa" w:w="1247"/>
             <w:vAlign w:val="center"/>
             <w:tcMar>
               <w:top w:w="70" w:type="dxa"/>
@@ -363,21 +432,132 @@
               <w:rPr>
                 <w:rFonts w:ascii="S-Core Dream" w:hAnsi="S-Core Dream" w:eastAsia="에스코어 드림"/>
                 <w:b w:val="0"/>
-                <w:color w:val="154541"/>
-                <w:sz w:val="14"/>
+                <w:color w:val="233A3E"/>
+                <w:sz w:val="18"/>
               </w:rPr>
-              <w:t>________________</w:t>
+            </w:r>
+          </w:p>
+        </w:tc>
+        <w:tc>
+          <w:tcPr>
+            <w:tcW w:type="dxa" w:w="1247"/>
+            <w:vAlign w:val="center"/>
+            <w:tcMar>
+              <w:top w:w="70" w:type="dxa"/>
+              <w:start w:w="80" w:type="dxa"/>
+              <w:bottom w:w="70" w:type="dxa"/>
+              <w:end w:w="80" w:type="dxa"/>
+            </w:tcMar>
+          </w:tcPr>
+          <w:p>
+            <w:pPr>
+              <w:spacing w:after="0" w:line="269" w:lineRule="auto"/>
+              <w:jc w:val="center"/>
+            </w:pPr>
+            <w:r/>
+            <w:r>
+              <w:rPr>
+                <w:rFonts w:ascii="S-Core Dream" w:hAnsi="S-Core Dream" w:eastAsia="에스코어 드림"/>
+                <w:b w:val="0"/>
+                <w:color w:val="233A3E"/>
+                <w:sz w:val="18"/>
+              </w:rPr>
+            </w:r>
+          </w:p>
+        </w:tc>
+        <w:tc>
+          <w:tcPr>
+            <w:tcW w:type="dxa" w:w="1247"/>
+            <w:vAlign w:val="center"/>
+            <w:tcMar>
+              <w:top w:w="70" w:type="dxa"/>
+              <w:start w:w="80" w:type="dxa"/>
+              <w:bottom w:w="70" w:type="dxa"/>
+              <w:end w:w="80" w:type="dxa"/>
+            </w:tcMar>
+          </w:tcPr>
+          <w:p>
+            <w:pPr>
+              <w:spacing w:after="0" w:line="269" w:lineRule="auto"/>
+              <w:jc w:val="center"/>
+            </w:pPr>
+            <w:r/>
+            <w:r>
+              <w:rPr>
+                <w:rFonts w:ascii="S-Core Dream" w:hAnsi="S-Core Dream" w:eastAsia="에스코어 드림"/>
+                <w:b w:val="0"/>
+                <w:color w:val="233A3E"/>
+                <w:sz w:val="18"/>
+              </w:rPr>
             </w:r>
           </w:p>
         </w:tc>
       </w:tr>
       <w:tr>
         <w:trPr>
-          <w:trHeight w:val="414" w:hRule="exact"/>
+          <w:trHeight w:val="493" w:hRule="atLeast"/>
         </w:trPr>
         <w:tc>
           <w:tcPr>
-            <w:tcW w:type="dxa" w:w="907"/>
+            <w:tcW w:type="dxa" w:w="737"/>
+            <w:vAlign w:val="center"/>
+            <w:tcMar>
+              <w:top w:w="70" w:type="dxa"/>
+              <w:start w:w="80" w:type="dxa"/>
+              <w:bottom w:w="70" w:type="dxa"/>
+              <w:end w:w="80" w:type="dxa"/>
+            </w:tcMar>
+            <w:shd w:fill="FFFDF7"/>
+          </w:tcPr>
+          <w:p>
+            <w:pPr>
+              <w:spacing w:after="0" w:line="269" w:lineRule="auto"/>
+              <w:jc w:val="center"/>
+            </w:pPr>
+            <w:r/>
+            <w:r>
+              <w:rPr>
+                <w:rFonts w:ascii="S-Core Dream" w:hAnsi="S-Core Dream" w:eastAsia="에스코어 드림"/>
+                <w:b/>
+                <w:color w:val="1F5D59"/>
+                <w:sz w:val="17"/>
+              </w:rPr>
+              <w:t>2</w:t>
+            </w:r>
+          </w:p>
+        </w:tc>
+        <w:tc>
+          <w:tcPr>
+            <w:tcW w:type="dxa" w:w="5046"/>
+            <w:vAlign w:val="center"/>
+            <w:tcMar>
+              <w:top w:w="70" w:type="dxa"/>
+              <w:start w:w="80" w:type="dxa"/>
+              <w:bottom w:w="70" w:type="dxa"/>
+              <w:end w:w="80" w:type="dxa"/>
+            </w:tcMar>
+            <w:shd w:fill="FFFDF7"/>
+          </w:tcPr>
+          <w:p>
+            <w:pPr>
+              <w:spacing w:after="0" w:line="269" w:lineRule="auto"/>
+              <w:jc w:val="left"/>
+            </w:pPr>
+            <w:r/>
+            <w:r>
+              <w:rPr>
+                <w:rFonts w:ascii="S-Core Dream" w:hAnsi="S-Core Dream" w:eastAsia="에스코어 드림"/>
+                <w:b w:val="0"/>
+                <w:color w:val="233A3E"/>
+                <w:sz w:val="18"/>
+              </w:rPr>
+              <w:t>다음에 읽을 책 골라 주기</w:t>
+            </w:r>
+          </w:p>
+        </w:tc>
+        <w:tc>
+          <w:tcPr>
+            <w:tcW w:type="dxa" w:w="1247"/>
             <w:vAlign w:val="center"/>
             <w:tcMar>
               <w:top w:w="70" w:type="dxa"/>
@@ -398,15 +578,301 @@
                 <w:rFonts w:ascii="S-Core Dream" w:hAnsi="S-Core Dream" w:eastAsia="에스코어 드림"/>
                 <w:b w:val="0"/>
                 <w:color w:val="233A3E"/>
-                <w:sz w:val="14"/>
+                <w:sz w:val="18"/>
               </w:rPr>
-              <w:t>2</w:t>
             </w:r>
           </w:p>
         </w:tc>
         <w:tc>
           <w:tcPr>
-            <w:tcW w:type="dxa" w:w="6746"/>
+            <w:tcW w:type="dxa" w:w="1247"/>
+            <w:vAlign w:val="center"/>
+            <w:tcMar>
+              <w:top w:w="70" w:type="dxa"/>
+              <w:start w:w="80" w:type="dxa"/>
+              <w:bottom w:w="70" w:type="dxa"/>
+              <w:end w:w="80" w:type="dxa"/>
+            </w:tcMar>
+            <w:shd w:fill="FFFDF7"/>
+          </w:tcPr>
+          <w:p>
+            <w:pPr>
+              <w:spacing w:after="0" w:line="269" w:lineRule="auto"/>
+              <w:jc w:val="center"/>
+            </w:pPr>
+            <w:r/>
+            <w:r>
+              <w:rPr>
+                <w:rFonts w:ascii="S-Core Dream" w:hAnsi="S-Core Dream" w:eastAsia="에스코어 드림"/>
+                <w:b w:val="0"/>
+                <w:color w:val="233A3E"/>
+                <w:sz w:val="18"/>
+              </w:rPr>
+            </w:r>
+          </w:p>
+        </w:tc>
+        <w:tc>
+          <w:tcPr>
+            <w:tcW w:type="dxa" w:w="1247"/>
+            <w:vAlign w:val="center"/>
+            <w:tcMar>
+              <w:top w:w="70" w:type="dxa"/>
+              <w:start w:w="80" w:type="dxa"/>
+              <w:bottom w:w="70" w:type="dxa"/>
+              <w:end w:w="80" w:type="dxa"/>
+            </w:tcMar>
+            <w:shd w:fill="FFFDF7"/>
+          </w:tcPr>
+          <w:p>
+            <w:pPr>
+              <w:spacing w:after="0" w:line="269" w:lineRule="auto"/>
+              <w:jc w:val="center"/>
+            </w:pPr>
+            <w:r/>
+            <w:r>
+              <w:rPr>
+                <w:rFonts w:ascii="S-Core Dream" w:hAnsi="S-Core Dream" w:eastAsia="에스코어 드림"/>
+                <w:b w:val="0"/>
+                <w:color w:val="233A3E"/>
+                <w:sz w:val="18"/>
+              </w:rPr>
+            </w:r>
+          </w:p>
+        </w:tc>
+        <w:tc>
+          <w:tcPr>
+            <w:tcW w:type="dxa" w:w="1247"/>
+            <w:vAlign w:val="center"/>
+            <w:tcMar>
+              <w:top w:w="70" w:type="dxa"/>
+              <w:start w:w="80" w:type="dxa"/>
+              <w:bottom w:w="70" w:type="dxa"/>
+              <w:end w:w="80" w:type="dxa"/>
+            </w:tcMar>
+            <w:shd w:fill="FFFDF7"/>
+          </w:tcPr>
+          <w:p>
+            <w:pPr>
+              <w:spacing w:after="0" w:line="269" w:lineRule="auto"/>
+              <w:jc w:val="center"/>
+            </w:pPr>
+            <w:r/>
+            <w:r>
+              <w:rPr>
+                <w:rFonts w:ascii="S-Core Dream" w:hAnsi="S-Core Dream" w:eastAsia="에스코어 드림"/>
+                <w:b w:val="0"/>
+                <w:color w:val="233A3E"/>
+                <w:sz w:val="18"/>
+              </w:rPr>
+            </w:r>
+          </w:p>
+        </w:tc>
+      </w:tr>
+      <w:tr>
+        <w:trPr>
+          <w:trHeight w:val="493" w:hRule="atLeast"/>
+        </w:trPr>
+        <w:tc>
+          <w:tcPr>
+            <w:tcW w:type="dxa" w:w="737"/>
+            <w:vAlign w:val="center"/>
+            <w:tcMar>
+              <w:top w:w="70" w:type="dxa"/>
+              <w:start w:w="80" w:type="dxa"/>
+              <w:bottom w:w="70" w:type="dxa"/>
+              <w:end w:w="80" w:type="dxa"/>
+            </w:tcMar>
+          </w:tcPr>
+          <w:p>
+            <w:pPr>
+              <w:spacing w:after="0" w:line="269" w:lineRule="auto"/>
+              <w:jc w:val="center"/>
+            </w:pPr>
+            <w:r/>
+            <w:r>
+              <w:rPr>
+                <w:rFonts w:ascii="S-Core Dream" w:hAnsi="S-Core Dream" w:eastAsia="에스코어 드림"/>
+                <w:b/>
+                <w:color w:val="1F5D59"/>
+                <w:sz w:val="17"/>
+              </w:rPr>
+              <w:t>3</w:t>
+            </w:r>
+          </w:p>
+        </w:tc>
+        <w:tc>
+          <w:tcPr>
+            <w:tcW w:type="dxa" w:w="5046"/>
+            <w:vAlign w:val="center"/>
+            <w:tcMar>
+              <w:top w:w="70" w:type="dxa"/>
+              <w:start w:w="80" w:type="dxa"/>
+              <w:bottom w:w="70" w:type="dxa"/>
+              <w:end w:w="80" w:type="dxa"/>
+            </w:tcMar>
+          </w:tcPr>
+          <w:p>
+            <w:pPr>
+              <w:spacing w:after="0" w:line="269" w:lineRule="auto"/>
+              <w:jc w:val="left"/>
+            </w:pPr>
+            <w:r/>
+            <w:r>
+              <w:rPr>
+                <w:rFonts w:ascii="S-Core Dream" w:hAnsi="S-Core Dream" w:eastAsia="에스코어 드림"/>
+                <w:b w:val="0"/>
+                <w:color w:val="233A3E"/>
+                <w:sz w:val="18"/>
+              </w:rPr>
+              <w:t>얼굴을 알아보고 잠금 풀기</w:t>
+            </w:r>
+          </w:p>
+        </w:tc>
+        <w:tc>
+          <w:tcPr>
+            <w:tcW w:type="dxa" w:w="1247"/>
+            <w:vAlign w:val="center"/>
+            <w:tcMar>
+              <w:top w:w="70" w:type="dxa"/>
+              <w:start w:w="80" w:type="dxa"/>
+              <w:bottom w:w="70" w:type="dxa"/>
+              <w:end w:w="80" w:type="dxa"/>
+            </w:tcMar>
+          </w:tcPr>
+          <w:p>
+            <w:pPr>
+              <w:spacing w:after="0" w:line="269" w:lineRule="auto"/>
+              <w:jc w:val="center"/>
+            </w:pPr>
+            <w:r/>
+            <w:r>
+              <w:rPr>
+                <w:rFonts w:ascii="S-Core Dream" w:hAnsi="S-Core Dream" w:eastAsia="에스코어 드림"/>
+                <w:b w:val="0"/>
+                <w:color w:val="233A3E"/>
+                <w:sz w:val="18"/>
+              </w:rPr>
+            </w:r>
+          </w:p>
+        </w:tc>
+        <w:tc>
+          <w:tcPr>
+            <w:tcW w:type="dxa" w:w="1247"/>
+            <w:vAlign w:val="center"/>
+            <w:tcMar>
+              <w:top w:w="70" w:type="dxa"/>
+              <w:start w:w="80" w:type="dxa"/>
+              <w:bottom w:w="70" w:type="dxa"/>
+              <w:end w:w="80" w:type="dxa"/>
+            </w:tcMar>
+          </w:tcPr>
+          <w:p>
+            <w:pPr>
+              <w:spacing w:after="0" w:line="269" w:lineRule="auto"/>
+              <w:jc w:val="center"/>
+            </w:pPr>
+            <w:r/>
+            <w:r>
+              <w:rPr>
+                <w:rFonts w:ascii="S-Core Dream" w:hAnsi="S-Core Dream" w:eastAsia="에스코어 드림"/>
+                <w:b w:val="0"/>
+                <w:color w:val="233A3E"/>
+                <w:sz w:val="18"/>
+              </w:rPr>
+            </w:r>
+          </w:p>
+        </w:tc>
+        <w:tc>
+          <w:tcPr>
+            <w:tcW w:type="dxa" w:w="1247"/>
+            <w:vAlign w:val="center"/>
+            <w:tcMar>
+              <w:top w:w="70" w:type="dxa"/>
+              <w:start w:w="80" w:type="dxa"/>
+              <w:bottom w:w="70" w:type="dxa"/>
+              <w:end w:w="80" w:type="dxa"/>
+            </w:tcMar>
+          </w:tcPr>
+          <w:p>
+            <w:pPr>
+              <w:spacing w:after="0" w:line="269" w:lineRule="auto"/>
+              <w:jc w:val="center"/>
+            </w:pPr>
+            <w:r/>
+            <w:r>
+              <w:rPr>
+                <w:rFonts w:ascii="S-Core Dream" w:hAnsi="S-Core Dream" w:eastAsia="에스코어 드림"/>
+                <w:b w:val="0"/>
+                <w:color w:val="233A3E"/>
+                <w:sz w:val="18"/>
+              </w:rPr>
+            </w:r>
+          </w:p>
+        </w:tc>
+        <w:tc>
+          <w:tcPr>
+            <w:tcW w:type="dxa" w:w="1247"/>
+            <w:vAlign w:val="center"/>
+            <w:tcMar>
+              <w:top w:w="70" w:type="dxa"/>
+              <w:start w:w="80" w:type="dxa"/>
+              <w:bottom w:w="70" w:type="dxa"/>
+              <w:end w:w="80" w:type="dxa"/>
+            </w:tcMar>
+          </w:tcPr>
+          <w:p>
+            <w:pPr>
+              <w:spacing w:after="0" w:line="269" w:lineRule="auto"/>
+              <w:jc w:val="center"/>
+            </w:pPr>
+            <w:r/>
+            <w:r>
+              <w:rPr>
+                <w:rFonts w:ascii="S-Core Dream" w:hAnsi="S-Core Dream" w:eastAsia="에스코어 드림"/>
+                <w:b w:val="0"/>
+                <w:color w:val="233A3E"/>
+                <w:sz w:val="18"/>
+              </w:rPr>
+            </w:r>
+          </w:p>
+        </w:tc>
+      </w:tr>
+      <w:tr>
+        <w:trPr>
+          <w:trHeight w:val="493" w:hRule="atLeast"/>
+        </w:trPr>
+        <w:tc>
+          <w:tcPr>
+            <w:tcW w:type="dxa" w:w="737"/>
+            <w:vAlign w:val="center"/>
+            <w:tcMar>
+              <w:top w:w="70" w:type="dxa"/>
+              <w:start w:w="80" w:type="dxa"/>
+              <w:bottom w:w="70" w:type="dxa"/>
+              <w:end w:w="80" w:type="dxa"/>
+            </w:tcMar>
+            <w:shd w:fill="FFFDF7"/>
+          </w:tcPr>
+          <w:p>
+            <w:pPr>
+              <w:spacing w:after="0" w:line="269" w:lineRule="auto"/>
+              <w:jc w:val="center"/>
+            </w:pPr>
+            <w:r/>
+            <w:r>
+              <w:rPr>
+                <w:rFonts w:ascii="S-Core Dream" w:hAnsi="S-Core Dream" w:eastAsia="에스코어 드림"/>
+                <w:b/>
+                <w:color w:val="1F5D59"/>
+                <w:sz w:val="17"/>
+              </w:rPr>
+              <w:t>4</w:t>
+            </w:r>
+          </w:p>
+        </w:tc>
+        <w:tc>
+          <w:tcPr>
+            <w:tcW w:type="dxa" w:w="5046"/>
             <w:vAlign w:val="center"/>
             <w:tcMar>
               <w:top w:w="70" w:type="dxa"/>
@@ -427,138 +893,15 @@
                 <w:rFonts w:ascii="S-Core Dream" w:hAnsi="S-Core Dream" w:eastAsia="에스코어 드림"/>
                 <w:b w:val="0"/>
                 <w:color w:val="233A3E"/>
-                <w:sz w:val="15"/>
+                <w:sz w:val="18"/>
               </w:rPr>
-              <w:t>다음에 읽을 책 골라 주기</w:t>
+              <w:t>말소리를 글자로 바꾸기</w:t>
             </w:r>
           </w:p>
         </w:tc>
         <w:tc>
           <w:tcPr>
-            <w:tcW w:type="dxa" w:w="2665"/>
-            <w:vAlign w:val="center"/>
-            <w:tcMar>
-              <w:top w:w="70" w:type="dxa"/>
-              <w:start w:w="80" w:type="dxa"/>
-              <w:bottom w:w="70" w:type="dxa"/>
-              <w:end w:w="80" w:type="dxa"/>
-            </w:tcMar>
-            <w:shd w:fill="FFFDF7"/>
-          </w:tcPr>
-          <w:p>
-            <w:pPr>
-              <w:spacing w:after="0" w:line="269" w:lineRule="auto"/>
-              <w:jc w:val="center"/>
-            </w:pPr>
-            <w:r/>
-            <w:r>
-              <w:rPr>
-                <w:rFonts w:ascii="S-Core Dream" w:hAnsi="S-Core Dream" w:eastAsia="에스코어 드림"/>
-                <w:b w:val="0"/>
-                <w:color w:val="154541"/>
-                <w:sz w:val="14"/>
-              </w:rPr>
-              <w:t>________________</w:t>
-            </w:r>
-          </w:p>
-        </w:tc>
-      </w:tr>
-      <w:tr>
-        <w:trPr>
-          <w:trHeight w:val="414" w:hRule="exact"/>
-        </w:trPr>
-        <w:tc>
-          <w:tcPr>
-            <w:tcW w:type="dxa" w:w="907"/>
-            <w:vAlign w:val="center"/>
-            <w:tcMar>
-              <w:top w:w="70" w:type="dxa"/>
-              <w:start w:w="80" w:type="dxa"/>
-              <w:bottom w:w="70" w:type="dxa"/>
-              <w:end w:w="80" w:type="dxa"/>
-            </w:tcMar>
-          </w:tcPr>
-          <w:p>
-            <w:pPr>
-              <w:spacing w:after="0" w:line="269" w:lineRule="auto"/>
-              <w:jc w:val="center"/>
-            </w:pPr>
-            <w:r/>
-            <w:r>
-              <w:rPr>
-                <w:rFonts w:ascii="S-Core Dream" w:hAnsi="S-Core Dream" w:eastAsia="에스코어 드림"/>
-                <w:b w:val="0"/>
-                <w:color w:val="233A3E"/>
-                <w:sz w:val="14"/>
-              </w:rPr>
-              <w:t>3</w:t>
-            </w:r>
-          </w:p>
-        </w:tc>
-        <w:tc>
-          <w:tcPr>
-            <w:tcW w:type="dxa" w:w="6746"/>
-            <w:vAlign w:val="center"/>
-            <w:tcMar>
-              <w:top w:w="70" w:type="dxa"/>
-              <w:start w:w="80" w:type="dxa"/>
-              <w:bottom w:w="70" w:type="dxa"/>
-              <w:end w:w="80" w:type="dxa"/>
-            </w:tcMar>
-          </w:tcPr>
-          <w:p>
-            <w:pPr>
-              <w:spacing w:after="0" w:line="269" w:lineRule="auto"/>
-              <w:jc w:val="left"/>
-            </w:pPr>
-            <w:r/>
-            <w:r>
-              <w:rPr>
-                <w:rFonts w:ascii="S-Core Dream" w:hAnsi="S-Core Dream" w:eastAsia="에스코어 드림"/>
-                <w:b w:val="0"/>
-                <w:color w:val="233A3E"/>
-                <w:sz w:val="15"/>
-              </w:rPr>
-              <w:t>얼굴을 알아보고 잠금 풀기</w:t>
-            </w:r>
-          </w:p>
-        </w:tc>
-        <w:tc>
-          <w:tcPr>
-            <w:tcW w:type="dxa" w:w="2665"/>
-            <w:vAlign w:val="center"/>
-            <w:tcMar>
-              <w:top w:w="70" w:type="dxa"/>
-              <w:start w:w="80" w:type="dxa"/>
-              <w:bottom w:w="70" w:type="dxa"/>
-              <w:end w:w="80" w:type="dxa"/>
-            </w:tcMar>
-          </w:tcPr>
-          <w:p>
-            <w:pPr>
-              <w:spacing w:after="0" w:line="269" w:lineRule="auto"/>
-              <w:jc w:val="center"/>
-            </w:pPr>
-            <w:r/>
-            <w:r>
-              <w:rPr>
-                <w:rFonts w:ascii="S-Core Dream" w:hAnsi="S-Core Dream" w:eastAsia="에스코어 드림"/>
-                <w:b w:val="0"/>
-                <w:color w:val="154541"/>
-                <w:sz w:val="14"/>
-              </w:rPr>
-              <w:t>________________</w:t>
-            </w:r>
-          </w:p>
-        </w:tc>
-      </w:tr>
-      <w:tr>
-        <w:trPr>
-          <w:trHeight w:val="414" w:hRule="exact"/>
-        </w:trPr>
-        <w:tc>
-          <w:tcPr>
-            <w:tcW w:type="dxa" w:w="907"/>
+            <w:tcW w:type="dxa" w:w="1247"/>
             <w:vAlign w:val="center"/>
             <w:tcMar>
               <w:top w:w="70" w:type="dxa"/>
@@ -579,15 +922,301 @@
                 <w:rFonts w:ascii="S-Core Dream" w:hAnsi="S-Core Dream" w:eastAsia="에스코어 드림"/>
                 <w:b w:val="0"/>
                 <w:color w:val="233A3E"/>
-                <w:sz w:val="14"/>
+                <w:sz w:val="18"/>
               </w:rPr>
-              <w:t>4</w:t>
             </w:r>
           </w:p>
         </w:tc>
         <w:tc>
           <w:tcPr>
-            <w:tcW w:type="dxa" w:w="6746"/>
+            <w:tcW w:type="dxa" w:w="1247"/>
+            <w:vAlign w:val="center"/>
+            <w:tcMar>
+              <w:top w:w="70" w:type="dxa"/>
+              <w:start w:w="80" w:type="dxa"/>
+              <w:bottom w:w="70" w:type="dxa"/>
+              <w:end w:w="80" w:type="dxa"/>
+            </w:tcMar>
+            <w:shd w:fill="FFFDF7"/>
+          </w:tcPr>
+          <w:p>
+            <w:pPr>
+              <w:spacing w:after="0" w:line="269" w:lineRule="auto"/>
+              <w:jc w:val="center"/>
+            </w:pPr>
+            <w:r/>
+            <w:r>
+              <w:rPr>
+                <w:rFonts w:ascii="S-Core Dream" w:hAnsi="S-Core Dream" w:eastAsia="에스코어 드림"/>
+                <w:b w:val="0"/>
+                <w:color w:val="233A3E"/>
+                <w:sz w:val="18"/>
+              </w:rPr>
+            </w:r>
+          </w:p>
+        </w:tc>
+        <w:tc>
+          <w:tcPr>
+            <w:tcW w:type="dxa" w:w="1247"/>
+            <w:vAlign w:val="center"/>
+            <w:tcMar>
+              <w:top w:w="70" w:type="dxa"/>
+              <w:start w:w="80" w:type="dxa"/>
+              <w:bottom w:w="70" w:type="dxa"/>
+              <w:end w:w="80" w:type="dxa"/>
+            </w:tcMar>
+            <w:shd w:fill="FFFDF7"/>
+          </w:tcPr>
+          <w:p>
+            <w:pPr>
+              <w:spacing w:after="0" w:line="269" w:lineRule="auto"/>
+              <w:jc w:val="center"/>
+            </w:pPr>
+            <w:r/>
+            <w:r>
+              <w:rPr>
+                <w:rFonts w:ascii="S-Core Dream" w:hAnsi="S-Core Dream" w:eastAsia="에스코어 드림"/>
+                <w:b w:val="0"/>
+                <w:color w:val="233A3E"/>
+                <w:sz w:val="18"/>
+              </w:rPr>
+            </w:r>
+          </w:p>
+        </w:tc>
+        <w:tc>
+          <w:tcPr>
+            <w:tcW w:type="dxa" w:w="1247"/>
+            <w:vAlign w:val="center"/>
+            <w:tcMar>
+              <w:top w:w="70" w:type="dxa"/>
+              <w:start w:w="80" w:type="dxa"/>
+              <w:bottom w:w="70" w:type="dxa"/>
+              <w:end w:w="80" w:type="dxa"/>
+            </w:tcMar>
+            <w:shd w:fill="FFFDF7"/>
+          </w:tcPr>
+          <w:p>
+            <w:pPr>
+              <w:spacing w:after="0" w:line="269" w:lineRule="auto"/>
+              <w:jc w:val="center"/>
+            </w:pPr>
+            <w:r/>
+            <w:r>
+              <w:rPr>
+                <w:rFonts w:ascii="S-Core Dream" w:hAnsi="S-Core Dream" w:eastAsia="에스코어 드림"/>
+                <w:b w:val="0"/>
+                <w:color w:val="233A3E"/>
+                <w:sz w:val="18"/>
+              </w:rPr>
+            </w:r>
+          </w:p>
+        </w:tc>
+      </w:tr>
+      <w:tr>
+        <w:trPr>
+          <w:trHeight w:val="493" w:hRule="atLeast"/>
+        </w:trPr>
+        <w:tc>
+          <w:tcPr>
+            <w:tcW w:type="dxa" w:w="737"/>
+            <w:vAlign w:val="center"/>
+            <w:tcMar>
+              <w:top w:w="70" w:type="dxa"/>
+              <w:start w:w="80" w:type="dxa"/>
+              <w:bottom w:w="70" w:type="dxa"/>
+              <w:end w:w="80" w:type="dxa"/>
+            </w:tcMar>
+          </w:tcPr>
+          <w:p>
+            <w:pPr>
+              <w:spacing w:after="0" w:line="269" w:lineRule="auto"/>
+              <w:jc w:val="center"/>
+            </w:pPr>
+            <w:r/>
+            <w:r>
+              <w:rPr>
+                <w:rFonts w:ascii="S-Core Dream" w:hAnsi="S-Core Dream" w:eastAsia="에스코어 드림"/>
+                <w:b/>
+                <w:color w:val="1F5D59"/>
+                <w:sz w:val="17"/>
+              </w:rPr>
+              <w:t>5</w:t>
+            </w:r>
+          </w:p>
+        </w:tc>
+        <w:tc>
+          <w:tcPr>
+            <w:tcW w:type="dxa" w:w="5046"/>
+            <w:vAlign w:val="center"/>
+            <w:tcMar>
+              <w:top w:w="70" w:type="dxa"/>
+              <w:start w:w="80" w:type="dxa"/>
+              <w:bottom w:w="70" w:type="dxa"/>
+              <w:end w:w="80" w:type="dxa"/>
+            </w:tcMar>
+          </w:tcPr>
+          <w:p>
+            <w:pPr>
+              <w:spacing w:after="0" w:line="269" w:lineRule="auto"/>
+              <w:jc w:val="left"/>
+            </w:pPr>
+            <w:r/>
+            <w:r>
+              <w:rPr>
+                <w:rFonts w:ascii="S-Core Dream" w:hAnsi="S-Core Dream" w:eastAsia="에스코어 드림"/>
+                <w:b w:val="0"/>
+                <w:color w:val="233A3E"/>
+                <w:sz w:val="18"/>
+              </w:rPr>
+              <w:t>사진을 동물·식물로 나누기</w:t>
+            </w:r>
+          </w:p>
+        </w:tc>
+        <w:tc>
+          <w:tcPr>
+            <w:tcW w:type="dxa" w:w="1247"/>
+            <w:vAlign w:val="center"/>
+            <w:tcMar>
+              <w:top w:w="70" w:type="dxa"/>
+              <w:start w:w="80" w:type="dxa"/>
+              <w:bottom w:w="70" w:type="dxa"/>
+              <w:end w:w="80" w:type="dxa"/>
+            </w:tcMar>
+          </w:tcPr>
+          <w:p>
+            <w:pPr>
+              <w:spacing w:after="0" w:line="269" w:lineRule="auto"/>
+              <w:jc w:val="center"/>
+            </w:pPr>
+            <w:r/>
+            <w:r>
+              <w:rPr>
+                <w:rFonts w:ascii="S-Core Dream" w:hAnsi="S-Core Dream" w:eastAsia="에스코어 드림"/>
+                <w:b w:val="0"/>
+                <w:color w:val="233A3E"/>
+                <w:sz w:val="18"/>
+              </w:rPr>
+            </w:r>
+          </w:p>
+        </w:tc>
+        <w:tc>
+          <w:tcPr>
+            <w:tcW w:type="dxa" w:w="1247"/>
+            <w:vAlign w:val="center"/>
+            <w:tcMar>
+              <w:top w:w="70" w:type="dxa"/>
+              <w:start w:w="80" w:type="dxa"/>
+              <w:bottom w:w="70" w:type="dxa"/>
+              <w:end w:w="80" w:type="dxa"/>
+            </w:tcMar>
+          </w:tcPr>
+          <w:p>
+            <w:pPr>
+              <w:spacing w:after="0" w:line="269" w:lineRule="auto"/>
+              <w:jc w:val="center"/>
+            </w:pPr>
+            <w:r/>
+            <w:r>
+              <w:rPr>
+                <w:rFonts w:ascii="S-Core Dream" w:hAnsi="S-Core Dream" w:eastAsia="에스코어 드림"/>
+                <w:b w:val="0"/>
+                <w:color w:val="233A3E"/>
+                <w:sz w:val="18"/>
+              </w:rPr>
+            </w:r>
+          </w:p>
+        </w:tc>
+        <w:tc>
+          <w:tcPr>
+            <w:tcW w:type="dxa" w:w="1247"/>
+            <w:vAlign w:val="center"/>
+            <w:tcMar>
+              <w:top w:w="70" w:type="dxa"/>
+              <w:start w:w="80" w:type="dxa"/>
+              <w:bottom w:w="70" w:type="dxa"/>
+              <w:end w:w="80" w:type="dxa"/>
+            </w:tcMar>
+          </w:tcPr>
+          <w:p>
+            <w:pPr>
+              <w:spacing w:after="0" w:line="269" w:lineRule="auto"/>
+              <w:jc w:val="center"/>
+            </w:pPr>
+            <w:r/>
+            <w:r>
+              <w:rPr>
+                <w:rFonts w:ascii="S-Core Dream" w:hAnsi="S-Core Dream" w:eastAsia="에스코어 드림"/>
+                <w:b w:val="0"/>
+                <w:color w:val="233A3E"/>
+                <w:sz w:val="18"/>
+              </w:rPr>
+            </w:r>
+          </w:p>
+        </w:tc>
+        <w:tc>
+          <w:tcPr>
+            <w:tcW w:type="dxa" w:w="1247"/>
+            <w:vAlign w:val="center"/>
+            <w:tcMar>
+              <w:top w:w="70" w:type="dxa"/>
+              <w:start w:w="80" w:type="dxa"/>
+              <w:bottom w:w="70" w:type="dxa"/>
+              <w:end w:w="80" w:type="dxa"/>
+            </w:tcMar>
+          </w:tcPr>
+          <w:p>
+            <w:pPr>
+              <w:spacing w:after="0" w:line="269" w:lineRule="auto"/>
+              <w:jc w:val="center"/>
+            </w:pPr>
+            <w:r/>
+            <w:r>
+              <w:rPr>
+                <w:rFonts w:ascii="S-Core Dream" w:hAnsi="S-Core Dream" w:eastAsia="에스코어 드림"/>
+                <w:b w:val="0"/>
+                <w:color w:val="233A3E"/>
+                <w:sz w:val="18"/>
+              </w:rPr>
+            </w:r>
+          </w:p>
+        </w:tc>
+      </w:tr>
+      <w:tr>
+        <w:trPr>
+          <w:trHeight w:val="493" w:hRule="atLeast"/>
+        </w:trPr>
+        <w:tc>
+          <w:tcPr>
+            <w:tcW w:type="dxa" w:w="737"/>
+            <w:vAlign w:val="center"/>
+            <w:tcMar>
+              <w:top w:w="70" w:type="dxa"/>
+              <w:start w:w="80" w:type="dxa"/>
+              <w:bottom w:w="70" w:type="dxa"/>
+              <w:end w:w="80" w:type="dxa"/>
+            </w:tcMar>
+            <w:shd w:fill="FFFDF7"/>
+          </w:tcPr>
+          <w:p>
+            <w:pPr>
+              <w:spacing w:after="0" w:line="269" w:lineRule="auto"/>
+              <w:jc w:val="center"/>
+            </w:pPr>
+            <w:r/>
+            <w:r>
+              <w:rPr>
+                <w:rFonts w:ascii="S-Core Dream" w:hAnsi="S-Core Dream" w:eastAsia="에스코어 드림"/>
+                <w:b/>
+                <w:color w:val="1F5D59"/>
+                <w:sz w:val="17"/>
+              </w:rPr>
+              <w:t>6</w:t>
+            </w:r>
+          </w:p>
+        </w:tc>
+        <w:tc>
+          <w:tcPr>
+            <w:tcW w:type="dxa" w:w="5046"/>
             <w:vAlign w:val="center"/>
             <w:tcMar>
               <w:top w:w="70" w:type="dxa"/>
@@ -608,138 +1237,15 @@
                 <w:rFonts w:ascii="S-Core Dream" w:hAnsi="S-Core Dream" w:eastAsia="에스코어 드림"/>
                 <w:b w:val="0"/>
                 <w:color w:val="233A3E"/>
-                <w:sz w:val="15"/>
+                <w:sz w:val="18"/>
               </w:rPr>
-              <w:t>말소리를 글자로 바꾸기</w:t>
+              <w:t>스팸 메일 가려내기</w:t>
             </w:r>
           </w:p>
         </w:tc>
         <w:tc>
           <w:tcPr>
-            <w:tcW w:type="dxa" w:w="2665"/>
-            <w:vAlign w:val="center"/>
-            <w:tcMar>
-              <w:top w:w="70" w:type="dxa"/>
-              <w:start w:w="80" w:type="dxa"/>
-              <w:bottom w:w="70" w:type="dxa"/>
-              <w:end w:w="80" w:type="dxa"/>
-            </w:tcMar>
-            <w:shd w:fill="FFFDF7"/>
-          </w:tcPr>
-          <w:p>
-            <w:pPr>
-              <w:spacing w:after="0" w:line="269" w:lineRule="auto"/>
-              <w:jc w:val="center"/>
-            </w:pPr>
-            <w:r/>
-            <w:r>
-              <w:rPr>
-                <w:rFonts w:ascii="S-Core Dream" w:hAnsi="S-Core Dream" w:eastAsia="에스코어 드림"/>
-                <w:b w:val="0"/>
-                <w:color w:val="154541"/>
-                <w:sz w:val="14"/>
-              </w:rPr>
-              <w:t>________________</w:t>
-            </w:r>
-          </w:p>
-        </w:tc>
-      </w:tr>
-      <w:tr>
-        <w:trPr>
-          <w:trHeight w:val="414" w:hRule="exact"/>
-        </w:trPr>
-        <w:tc>
-          <w:tcPr>
-            <w:tcW w:type="dxa" w:w="907"/>
-            <w:vAlign w:val="center"/>
-            <w:tcMar>
-              <w:top w:w="70" w:type="dxa"/>
-              <w:start w:w="80" w:type="dxa"/>
-              <w:bottom w:w="70" w:type="dxa"/>
-              <w:end w:w="80" w:type="dxa"/>
-            </w:tcMar>
-          </w:tcPr>
-          <w:p>
-            <w:pPr>
-              <w:spacing w:after="0" w:line="269" w:lineRule="auto"/>
-              <w:jc w:val="center"/>
-            </w:pPr>
-            <w:r/>
-            <w:r>
-              <w:rPr>
-                <w:rFonts w:ascii="S-Core Dream" w:hAnsi="S-Core Dream" w:eastAsia="에스코어 드림"/>
-                <w:b w:val="0"/>
-                <w:color w:val="233A3E"/>
-                <w:sz w:val="14"/>
-              </w:rPr>
-              <w:t>5</w:t>
-            </w:r>
-          </w:p>
-        </w:tc>
-        <w:tc>
-          <w:tcPr>
-            <w:tcW w:type="dxa" w:w="6746"/>
-            <w:vAlign w:val="center"/>
-            <w:tcMar>
-              <w:top w:w="70" w:type="dxa"/>
-              <w:start w:w="80" w:type="dxa"/>
-              <w:bottom w:w="70" w:type="dxa"/>
-              <w:end w:w="80" w:type="dxa"/>
-            </w:tcMar>
-          </w:tcPr>
-          <w:p>
-            <w:pPr>
-              <w:spacing w:after="0" w:line="269" w:lineRule="auto"/>
-              <w:jc w:val="left"/>
-            </w:pPr>
-            <w:r/>
-            <w:r>
-              <w:rPr>
-                <w:rFonts w:ascii="S-Core Dream" w:hAnsi="S-Core Dream" w:eastAsia="에스코어 드림"/>
-                <w:b w:val="0"/>
-                <w:color w:val="233A3E"/>
-                <w:sz w:val="15"/>
-              </w:rPr>
-              <w:t>사진을 동물·식물로 나누기</w:t>
-            </w:r>
-          </w:p>
-        </w:tc>
-        <w:tc>
-          <w:tcPr>
-            <w:tcW w:type="dxa" w:w="2665"/>
-            <w:vAlign w:val="center"/>
-            <w:tcMar>
-              <w:top w:w="70" w:type="dxa"/>
-              <w:start w:w="80" w:type="dxa"/>
-              <w:bottom w:w="70" w:type="dxa"/>
-              <w:end w:w="80" w:type="dxa"/>
-            </w:tcMar>
-          </w:tcPr>
-          <w:p>
-            <w:pPr>
-              <w:spacing w:after="0" w:line="269" w:lineRule="auto"/>
-              <w:jc w:val="center"/>
-            </w:pPr>
-            <w:r/>
-            <w:r>
-              <w:rPr>
-                <w:rFonts w:ascii="S-Core Dream" w:hAnsi="S-Core Dream" w:eastAsia="에스코어 드림"/>
-                <w:b w:val="0"/>
-                <w:color w:val="154541"/>
-                <w:sz w:val="14"/>
-              </w:rPr>
-              <w:t>________________</w:t>
-            </w:r>
-          </w:p>
-        </w:tc>
-      </w:tr>
-      <w:tr>
-        <w:trPr>
-          <w:trHeight w:val="414" w:hRule="exact"/>
-        </w:trPr>
-        <w:tc>
-          <w:tcPr>
-            <w:tcW w:type="dxa" w:w="907"/>
+            <w:tcW w:type="dxa" w:w="1247"/>
             <w:vAlign w:val="center"/>
             <w:tcMar>
               <w:top w:w="70" w:type="dxa"/>
@@ -760,15 +1266,301 @@
                 <w:rFonts w:ascii="S-Core Dream" w:hAnsi="S-Core Dream" w:eastAsia="에스코어 드림"/>
                 <w:b w:val="0"/>
                 <w:color w:val="233A3E"/>
-                <w:sz w:val="14"/>
+                <w:sz w:val="18"/>
               </w:rPr>
-              <w:t>6</w:t>
             </w:r>
           </w:p>
         </w:tc>
         <w:tc>
           <w:tcPr>
-            <w:tcW w:type="dxa" w:w="6746"/>
+            <w:tcW w:type="dxa" w:w="1247"/>
+            <w:vAlign w:val="center"/>
+            <w:tcMar>
+              <w:top w:w="70" w:type="dxa"/>
+              <w:start w:w="80" w:type="dxa"/>
+              <w:bottom w:w="70" w:type="dxa"/>
+              <w:end w:w="80" w:type="dxa"/>
+            </w:tcMar>
+            <w:shd w:fill="FFFDF7"/>
+          </w:tcPr>
+          <w:p>
+            <w:pPr>
+              <w:spacing w:after="0" w:line="269" w:lineRule="auto"/>
+              <w:jc w:val="center"/>
+            </w:pPr>
+            <w:r/>
+            <w:r>
+              <w:rPr>
+                <w:rFonts w:ascii="S-Core Dream" w:hAnsi="S-Core Dream" w:eastAsia="에스코어 드림"/>
+                <w:b w:val="0"/>
+                <w:color w:val="233A3E"/>
+                <w:sz w:val="18"/>
+              </w:rPr>
+            </w:r>
+          </w:p>
+        </w:tc>
+        <w:tc>
+          <w:tcPr>
+            <w:tcW w:type="dxa" w:w="1247"/>
+            <w:vAlign w:val="center"/>
+            <w:tcMar>
+              <w:top w:w="70" w:type="dxa"/>
+              <w:start w:w="80" w:type="dxa"/>
+              <w:bottom w:w="70" w:type="dxa"/>
+              <w:end w:w="80" w:type="dxa"/>
+            </w:tcMar>
+            <w:shd w:fill="FFFDF7"/>
+          </w:tcPr>
+          <w:p>
+            <w:pPr>
+              <w:spacing w:after="0" w:line="269" w:lineRule="auto"/>
+              <w:jc w:val="center"/>
+            </w:pPr>
+            <w:r/>
+            <w:r>
+              <w:rPr>
+                <w:rFonts w:ascii="S-Core Dream" w:hAnsi="S-Core Dream" w:eastAsia="에스코어 드림"/>
+                <w:b w:val="0"/>
+                <w:color w:val="233A3E"/>
+                <w:sz w:val="18"/>
+              </w:rPr>
+            </w:r>
+          </w:p>
+        </w:tc>
+        <w:tc>
+          <w:tcPr>
+            <w:tcW w:type="dxa" w:w="1247"/>
+            <w:vAlign w:val="center"/>
+            <w:tcMar>
+              <w:top w:w="70" w:type="dxa"/>
+              <w:start w:w="80" w:type="dxa"/>
+              <w:bottom w:w="70" w:type="dxa"/>
+              <w:end w:w="80" w:type="dxa"/>
+            </w:tcMar>
+            <w:shd w:fill="FFFDF7"/>
+          </w:tcPr>
+          <w:p>
+            <w:pPr>
+              <w:spacing w:after="0" w:line="269" w:lineRule="auto"/>
+              <w:jc w:val="center"/>
+            </w:pPr>
+            <w:r/>
+            <w:r>
+              <w:rPr>
+                <w:rFonts w:ascii="S-Core Dream" w:hAnsi="S-Core Dream" w:eastAsia="에스코어 드림"/>
+                <w:b w:val="0"/>
+                <w:color w:val="233A3E"/>
+                <w:sz w:val="18"/>
+              </w:rPr>
+            </w:r>
+          </w:p>
+        </w:tc>
+      </w:tr>
+      <w:tr>
+        <w:trPr>
+          <w:trHeight w:val="493" w:hRule="atLeast"/>
+        </w:trPr>
+        <w:tc>
+          <w:tcPr>
+            <w:tcW w:type="dxa" w:w="737"/>
+            <w:vAlign w:val="center"/>
+            <w:tcMar>
+              <w:top w:w="70" w:type="dxa"/>
+              <w:start w:w="80" w:type="dxa"/>
+              <w:bottom w:w="70" w:type="dxa"/>
+              <w:end w:w="80" w:type="dxa"/>
+            </w:tcMar>
+          </w:tcPr>
+          <w:p>
+            <w:pPr>
+              <w:spacing w:after="0" w:line="269" w:lineRule="auto"/>
+              <w:jc w:val="center"/>
+            </w:pPr>
+            <w:r/>
+            <w:r>
+              <w:rPr>
+                <w:rFonts w:ascii="S-Core Dream" w:hAnsi="S-Core Dream" w:eastAsia="에스코어 드림"/>
+                <w:b/>
+                <w:color w:val="1F5D59"/>
+                <w:sz w:val="17"/>
+              </w:rPr>
+              <w:t>7</w:t>
+            </w:r>
+          </w:p>
+        </w:tc>
+        <w:tc>
+          <w:tcPr>
+            <w:tcW w:type="dxa" w:w="5046"/>
+            <w:vAlign w:val="center"/>
+            <w:tcMar>
+              <w:top w:w="70" w:type="dxa"/>
+              <w:start w:w="80" w:type="dxa"/>
+              <w:bottom w:w="70" w:type="dxa"/>
+              <w:end w:w="80" w:type="dxa"/>
+            </w:tcMar>
+          </w:tcPr>
+          <w:p>
+            <w:pPr>
+              <w:spacing w:after="0" w:line="269" w:lineRule="auto"/>
+              <w:jc w:val="left"/>
+            </w:pPr>
+            <w:r/>
+            <w:r>
+              <w:rPr>
+                <w:rFonts w:ascii="S-Core Dream" w:hAnsi="S-Core Dream" w:eastAsia="에스코어 드림"/>
+                <w:b w:val="0"/>
+                <w:color w:val="233A3E"/>
+                <w:sz w:val="18"/>
+              </w:rPr>
+              <w:t>10분 뒤 알람 울리기</w:t>
+            </w:r>
+          </w:p>
+        </w:tc>
+        <w:tc>
+          <w:tcPr>
+            <w:tcW w:type="dxa" w:w="1247"/>
+            <w:vAlign w:val="center"/>
+            <w:tcMar>
+              <w:top w:w="70" w:type="dxa"/>
+              <w:start w:w="80" w:type="dxa"/>
+              <w:bottom w:w="70" w:type="dxa"/>
+              <w:end w:w="80" w:type="dxa"/>
+            </w:tcMar>
+          </w:tcPr>
+          <w:p>
+            <w:pPr>
+              <w:spacing w:after="0" w:line="269" w:lineRule="auto"/>
+              <w:jc w:val="center"/>
+            </w:pPr>
+            <w:r/>
+            <w:r>
+              <w:rPr>
+                <w:rFonts w:ascii="S-Core Dream" w:hAnsi="S-Core Dream" w:eastAsia="에스코어 드림"/>
+                <w:b w:val="0"/>
+                <w:color w:val="233A3E"/>
+                <w:sz w:val="18"/>
+              </w:rPr>
+            </w:r>
+          </w:p>
+        </w:tc>
+        <w:tc>
+          <w:tcPr>
+            <w:tcW w:type="dxa" w:w="1247"/>
+            <w:vAlign w:val="center"/>
+            <w:tcMar>
+              <w:top w:w="70" w:type="dxa"/>
+              <w:start w:w="80" w:type="dxa"/>
+              <w:bottom w:w="70" w:type="dxa"/>
+              <w:end w:w="80" w:type="dxa"/>
+            </w:tcMar>
+          </w:tcPr>
+          <w:p>
+            <w:pPr>
+              <w:spacing w:after="0" w:line="269" w:lineRule="auto"/>
+              <w:jc w:val="center"/>
+            </w:pPr>
+            <w:r/>
+            <w:r>
+              <w:rPr>
+                <w:rFonts w:ascii="S-Core Dream" w:hAnsi="S-Core Dream" w:eastAsia="에스코어 드림"/>
+                <w:b w:val="0"/>
+                <w:color w:val="233A3E"/>
+                <w:sz w:val="18"/>
+              </w:rPr>
+            </w:r>
+          </w:p>
+        </w:tc>
+        <w:tc>
+          <w:tcPr>
+            <w:tcW w:type="dxa" w:w="1247"/>
+            <w:vAlign w:val="center"/>
+            <w:tcMar>
+              <w:top w:w="70" w:type="dxa"/>
+              <w:start w:w="80" w:type="dxa"/>
+              <w:bottom w:w="70" w:type="dxa"/>
+              <w:end w:w="80" w:type="dxa"/>
+            </w:tcMar>
+          </w:tcPr>
+          <w:p>
+            <w:pPr>
+              <w:spacing w:after="0" w:line="269" w:lineRule="auto"/>
+              <w:jc w:val="center"/>
+            </w:pPr>
+            <w:r/>
+            <w:r>
+              <w:rPr>
+                <w:rFonts w:ascii="S-Core Dream" w:hAnsi="S-Core Dream" w:eastAsia="에스코어 드림"/>
+                <w:b w:val="0"/>
+                <w:color w:val="233A3E"/>
+                <w:sz w:val="18"/>
+              </w:rPr>
+            </w:r>
+          </w:p>
+        </w:tc>
+        <w:tc>
+          <w:tcPr>
+            <w:tcW w:type="dxa" w:w="1247"/>
+            <w:vAlign w:val="center"/>
+            <w:tcMar>
+              <w:top w:w="70" w:type="dxa"/>
+              <w:start w:w="80" w:type="dxa"/>
+              <w:bottom w:w="70" w:type="dxa"/>
+              <w:end w:w="80" w:type="dxa"/>
+            </w:tcMar>
+          </w:tcPr>
+          <w:p>
+            <w:pPr>
+              <w:spacing w:after="0" w:line="269" w:lineRule="auto"/>
+              <w:jc w:val="center"/>
+            </w:pPr>
+            <w:r/>
+            <w:r>
+              <w:rPr>
+                <w:rFonts w:ascii="S-Core Dream" w:hAnsi="S-Core Dream" w:eastAsia="에스코어 드림"/>
+                <w:b w:val="0"/>
+                <w:color w:val="233A3E"/>
+                <w:sz w:val="18"/>
+              </w:rPr>
+            </w:r>
+          </w:p>
+        </w:tc>
+      </w:tr>
+      <w:tr>
+        <w:trPr>
+          <w:trHeight w:val="493" w:hRule="atLeast"/>
+        </w:trPr>
+        <w:tc>
+          <w:tcPr>
+            <w:tcW w:type="dxa" w:w="737"/>
+            <w:vAlign w:val="center"/>
+            <w:tcMar>
+              <w:top w:w="70" w:type="dxa"/>
+              <w:start w:w="80" w:type="dxa"/>
+              <w:bottom w:w="70" w:type="dxa"/>
+              <w:end w:w="80" w:type="dxa"/>
+            </w:tcMar>
+            <w:shd w:fill="FFFDF7"/>
+          </w:tcPr>
+          <w:p>
+            <w:pPr>
+              <w:spacing w:after="0" w:line="269" w:lineRule="auto"/>
+              <w:jc w:val="center"/>
+            </w:pPr>
+            <w:r/>
+            <w:r>
+              <w:rPr>
+                <w:rFonts w:ascii="S-Core Dream" w:hAnsi="S-Core Dream" w:eastAsia="에스코어 드림"/>
+                <w:b/>
+                <w:color w:val="1F5D59"/>
+                <w:sz w:val="17"/>
+              </w:rPr>
+              <w:t>8</w:t>
+            </w:r>
+          </w:p>
+        </w:tc>
+        <w:tc>
+          <w:tcPr>
+            <w:tcW w:type="dxa" w:w="5046"/>
             <w:vAlign w:val="center"/>
             <w:tcMar>
               <w:top w:w="70" w:type="dxa"/>
@@ -789,138 +1581,15 @@
                 <w:rFonts w:ascii="S-Core Dream" w:hAnsi="S-Core Dream" w:eastAsia="에스코어 드림"/>
                 <w:b w:val="0"/>
                 <w:color w:val="233A3E"/>
-                <w:sz w:val="15"/>
+                <w:sz w:val="18"/>
               </w:rPr>
-              <w:t>스팸 메일 가려내기</w:t>
+              <w:t>센서 자동문 열기</w:t>
             </w:r>
           </w:p>
         </w:tc>
         <w:tc>
           <w:tcPr>
-            <w:tcW w:type="dxa" w:w="2665"/>
-            <w:vAlign w:val="center"/>
-            <w:tcMar>
-              <w:top w:w="70" w:type="dxa"/>
-              <w:start w:w="80" w:type="dxa"/>
-              <w:bottom w:w="70" w:type="dxa"/>
-              <w:end w:w="80" w:type="dxa"/>
-            </w:tcMar>
-            <w:shd w:fill="FFFDF7"/>
-          </w:tcPr>
-          <w:p>
-            <w:pPr>
-              <w:spacing w:after="0" w:line="269" w:lineRule="auto"/>
-              <w:jc w:val="center"/>
-            </w:pPr>
-            <w:r/>
-            <w:r>
-              <w:rPr>
-                <w:rFonts w:ascii="S-Core Dream" w:hAnsi="S-Core Dream" w:eastAsia="에스코어 드림"/>
-                <w:b w:val="0"/>
-                <w:color w:val="154541"/>
-                <w:sz w:val="14"/>
-              </w:rPr>
-              <w:t>________________</w:t>
-            </w:r>
-          </w:p>
-        </w:tc>
-      </w:tr>
-      <w:tr>
-        <w:trPr>
-          <w:trHeight w:val="414" w:hRule="exact"/>
-        </w:trPr>
-        <w:tc>
-          <w:tcPr>
-            <w:tcW w:type="dxa" w:w="907"/>
-            <w:vAlign w:val="center"/>
-            <w:tcMar>
-              <w:top w:w="70" w:type="dxa"/>
-              <w:start w:w="80" w:type="dxa"/>
-              <w:bottom w:w="70" w:type="dxa"/>
-              <w:end w:w="80" w:type="dxa"/>
-            </w:tcMar>
-          </w:tcPr>
-          <w:p>
-            <w:pPr>
-              <w:spacing w:after="0" w:line="269" w:lineRule="auto"/>
-              <w:jc w:val="center"/>
-            </w:pPr>
-            <w:r/>
-            <w:r>
-              <w:rPr>
-                <w:rFonts w:ascii="S-Core Dream" w:hAnsi="S-Core Dream" w:eastAsia="에스코어 드림"/>
-                <w:b w:val="0"/>
-                <w:color w:val="233A3E"/>
-                <w:sz w:val="14"/>
-              </w:rPr>
-              <w:t>7</w:t>
-            </w:r>
-          </w:p>
-        </w:tc>
-        <w:tc>
-          <w:tcPr>
-            <w:tcW w:type="dxa" w:w="6746"/>
-            <w:vAlign w:val="center"/>
-            <w:tcMar>
-              <w:top w:w="70" w:type="dxa"/>
-              <w:start w:w="80" w:type="dxa"/>
-              <w:bottom w:w="70" w:type="dxa"/>
-              <w:end w:w="80" w:type="dxa"/>
-            </w:tcMar>
-          </w:tcPr>
-          <w:p>
-            <w:pPr>
-              <w:spacing w:after="0" w:line="269" w:lineRule="auto"/>
-              <w:jc w:val="left"/>
-            </w:pPr>
-            <w:r/>
-            <w:r>
-              <w:rPr>
-                <w:rFonts w:ascii="S-Core Dream" w:hAnsi="S-Core Dream" w:eastAsia="에스코어 드림"/>
-                <w:b w:val="0"/>
-                <w:color w:val="233A3E"/>
-                <w:sz w:val="15"/>
-              </w:rPr>
-              <w:t>10분 뒤 알람 울리기</w:t>
-            </w:r>
-          </w:p>
-        </w:tc>
-        <w:tc>
-          <w:tcPr>
-            <w:tcW w:type="dxa" w:w="2665"/>
-            <w:vAlign w:val="center"/>
-            <w:tcMar>
-              <w:top w:w="70" w:type="dxa"/>
-              <w:start w:w="80" w:type="dxa"/>
-              <w:bottom w:w="70" w:type="dxa"/>
-              <w:end w:w="80" w:type="dxa"/>
-            </w:tcMar>
-          </w:tcPr>
-          <w:p>
-            <w:pPr>
-              <w:spacing w:after="0" w:line="269" w:lineRule="auto"/>
-              <w:jc w:val="center"/>
-            </w:pPr>
-            <w:r/>
-            <w:r>
-              <w:rPr>
-                <w:rFonts w:ascii="S-Core Dream" w:hAnsi="S-Core Dream" w:eastAsia="에스코어 드림"/>
-                <w:b w:val="0"/>
-                <w:color w:val="154541"/>
-                <w:sz w:val="14"/>
-              </w:rPr>
-              <w:t>________________</w:t>
-            </w:r>
-          </w:p>
-        </w:tc>
-      </w:tr>
-      <w:tr>
-        <w:trPr>
-          <w:trHeight w:val="414" w:hRule="exact"/>
-        </w:trPr>
-        <w:tc>
-          <w:tcPr>
-            <w:tcW w:type="dxa" w:w="907"/>
+            <w:tcW w:type="dxa" w:w="1247"/>
             <w:vAlign w:val="center"/>
             <w:tcMar>
               <w:top w:w="70" w:type="dxa"/>
@@ -941,44 +1610,14 @@
                 <w:rFonts w:ascii="S-Core Dream" w:hAnsi="S-Core Dream" w:eastAsia="에스코어 드림"/>
                 <w:b w:val="0"/>
                 <w:color w:val="233A3E"/>
-                <w:sz w:val="14"/>
+                <w:sz w:val="18"/>
               </w:rPr>
-              <w:t>8</w:t>
             </w:r>
           </w:p>
         </w:tc>
         <w:tc>
           <w:tcPr>
-            <w:tcW w:type="dxa" w:w="6746"/>
-            <w:vAlign w:val="center"/>
-            <w:tcMar>
-              <w:top w:w="70" w:type="dxa"/>
-              <w:start w:w="80" w:type="dxa"/>
-              <w:bottom w:w="70" w:type="dxa"/>
-              <w:end w:w="80" w:type="dxa"/>
-            </w:tcMar>
-            <w:shd w:fill="FFFDF7"/>
-          </w:tcPr>
-          <w:p>
-            <w:pPr>
-              <w:spacing w:after="0" w:line="269" w:lineRule="auto"/>
-              <w:jc w:val="left"/>
-            </w:pPr>
-            <w:r/>
-            <w:r>
-              <w:rPr>
-                <w:rFonts w:ascii="S-Core Dream" w:hAnsi="S-Core Dream" w:eastAsia="에스코어 드림"/>
-                <w:b w:val="0"/>
-                <w:color w:val="233A3E"/>
-                <w:sz w:val="15"/>
-              </w:rPr>
-              <w:t>센서 자동문 열기</w:t>
-            </w:r>
-          </w:p>
-        </w:tc>
-        <w:tc>
-          <w:tcPr>
-            <w:tcW w:type="dxa" w:w="2665"/>
+            <w:tcW w:type="dxa" w:w="1247"/>
             <w:vAlign w:val="center"/>
             <w:tcMar>
               <w:top w:w="70" w:type="dxa"/>
@@ -998,10 +1637,65 @@
               <w:rPr>
                 <w:rFonts w:ascii="S-Core Dream" w:hAnsi="S-Core Dream" w:eastAsia="에스코어 드림"/>
                 <w:b w:val="0"/>
-                <w:color w:val="154541"/>
-                <w:sz w:val="14"/>
+                <w:color w:val="233A3E"/>
+                <w:sz w:val="18"/>
               </w:rPr>
-              <w:t>________________</w:t>
+            </w:r>
+          </w:p>
+        </w:tc>
+        <w:tc>
+          <w:tcPr>
+            <w:tcW w:type="dxa" w:w="1247"/>
+            <w:vAlign w:val="center"/>
+            <w:tcMar>
+              <w:top w:w="70" w:type="dxa"/>
+              <w:start w:w="80" w:type="dxa"/>
+              <w:bottom w:w="70" w:type="dxa"/>
+              <w:end w:w="80" w:type="dxa"/>
+            </w:tcMar>
+            <w:shd w:fill="FFFDF7"/>
+          </w:tcPr>
+          <w:p>
+            <w:pPr>
+              <w:spacing w:after="0" w:line="269" w:lineRule="auto"/>
+              <w:jc w:val="center"/>
+            </w:pPr>
+            <w:r/>
+            <w:r>
+              <w:rPr>
+                <w:rFonts w:ascii="S-Core Dream" w:hAnsi="S-Core Dream" w:eastAsia="에스코어 드림"/>
+                <w:b w:val="0"/>
+                <w:color w:val="233A3E"/>
+                <w:sz w:val="18"/>
+              </w:rPr>
+            </w:r>
+          </w:p>
+        </w:tc>
+        <w:tc>
+          <w:tcPr>
+            <w:tcW w:type="dxa" w:w="1247"/>
+            <w:vAlign w:val="center"/>
+            <w:tcMar>
+              <w:top w:w="70" w:type="dxa"/>
+              <w:start w:w="80" w:type="dxa"/>
+              <w:bottom w:w="70" w:type="dxa"/>
+              <w:end w:w="80" w:type="dxa"/>
+            </w:tcMar>
+            <w:shd w:fill="FFFDF7"/>
+          </w:tcPr>
+          <w:p>
+            <w:pPr>
+              <w:spacing w:after="0" w:line="269" w:lineRule="auto"/>
+              <w:jc w:val="center"/>
+            </w:pPr>
+            <w:r/>
+            <w:r>
+              <w:rPr>
+                <w:rFonts w:ascii="S-Core Dream" w:hAnsi="S-Core Dream" w:eastAsia="에스코어 드림"/>
+                <w:b w:val="0"/>
+                <w:color w:val="233A3E"/>
+                <w:sz w:val="18"/>
+              </w:rPr>
             </w:r>
           </w:p>
         </w:tc>
@@ -1016,7 +1710,7 @@
           <w:rFonts w:ascii="S-Core Dream" w:hAnsi="S-Core Dream" w:eastAsia="에스코어 드림"/>
           <w:b/>
           <w:color w:val="1F5D59"/>
-          <w:sz w:val="18"/>
+          <w:sz w:val="20"/>
         </w:rPr>
         <w:t xml:space="preserve">2  </w:t>
       </w:r>
@@ -1025,14 +1719,15 @@
           <w:rFonts w:ascii="S-Core Dream" w:hAnsi="S-Core Dream" w:eastAsia="에스코어 드림"/>
           <w:b/>
           <w:color w:val="233A3E"/>
-          <w:sz w:val="18"/>
+          <w:sz w:val="20"/>
         </w:rPr>
-        <w:t>AI와 자동 기계를 구별한 까닭을 한 가지씩 쓰세요.</w:t>
+        <w:t>알맞은 말에 ○표하세요.</w:t>
       </w:r>
     </w:p>
     <w:tbl>
       <w:tblPr>
         <w:tblW w:type="auto" w:w="0"/>
+        <w:tblLayout w:type="fixed"/>
         <w:tblLook w:firstColumn="1" w:firstRow="1" w:lastColumn="0" w:lastRow="0" w:noHBand="0" w:noVBand="1" w:val="04A0"/>
         <w:tblBorders>
           <w:top w:val="single" w:sz="5" w:space="0" w:color="AFC0B9"/>
@@ -1044,16 +1739,182 @@
         </w:tblBorders>
       </w:tblPr>
       <w:tblGrid>
-        <w:gridCol w:w="5329"/>
-        <w:gridCol w:w="5329"/>
+        <w:gridCol w:w="4309"/>
+        <w:gridCol w:w="6463"/>
       </w:tblGrid>
       <w:tr>
         <w:trPr>
-          <w:trHeight w:val="397" w:hRule="exact"/>
+          <w:trHeight w:val="709" w:hRule="atLeast"/>
         </w:trPr>
         <w:tc>
           <w:tcPr>
-            <w:tcW w:type="dxa" w:w="5329"/>
+            <w:tcW w:type="dxa" w:w="4309"/>
+            <w:vAlign w:val="center"/>
+            <w:tcMar>
+              <w:top w:w="70" w:type="dxa"/>
+              <w:start w:w="80" w:type="dxa"/>
+              <w:bottom w:w="70" w:type="dxa"/>
+              <w:end w:w="80" w:type="dxa"/>
+            </w:tcMar>
+            <w:shd w:fill="E4EFEA"/>
+          </w:tcPr>
+          <w:p>
+            <w:pPr>
+              <w:spacing w:after="0" w:line="269" w:lineRule="auto"/>
+              <w:jc w:val="left"/>
+            </w:pPr>
+            <w:r/>
+            <w:r>
+              <w:rPr>
+                <w:rFonts w:ascii="S-Core Dream" w:hAnsi="S-Core Dream" w:eastAsia="에스코어 드림"/>
+                <w:b/>
+                <w:color w:val="154541"/>
+                <w:sz w:val="17"/>
+              </w:rPr>
+              <w:t>AI가 결과를 정할 때 살펴보는 것</w:t>
+            </w:r>
+          </w:p>
+        </w:tc>
+        <w:tc>
+          <w:tcPr>
+            <w:tcW w:type="dxa" w:w="6463"/>
+            <w:vAlign w:val="center"/>
+            <w:tcMar>
+              <w:top w:w="70" w:type="dxa"/>
+              <w:start w:w="80" w:type="dxa"/>
+              <w:bottom w:w="70" w:type="dxa"/>
+              <w:end w:w="80" w:type="dxa"/>
+            </w:tcMar>
+          </w:tcPr>
+          <w:p>
+            <w:pPr>
+              <w:spacing w:after="0" w:line="269" w:lineRule="auto"/>
+              <w:jc w:val="center"/>
+            </w:pPr>
+            <w:r/>
+            <w:r>
+              <w:rPr>
+                <w:rFonts w:ascii="S-Core Dream" w:hAnsi="S-Core Dream" w:eastAsia="에스코어 드림"/>
+                <w:b/>
+                <w:color w:val="233A3E"/>
+                <w:sz w:val="18"/>
+              </w:rPr>
+              <w:t>데이터     /     정해진 시간</w:t>
+            </w:r>
+          </w:p>
+        </w:tc>
+      </w:tr>
+      <w:tr>
+        <w:trPr>
+          <w:trHeight w:val="709" w:hRule="atLeast"/>
+        </w:trPr>
+        <w:tc>
+          <w:tcPr>
+            <w:tcW w:type="dxa" w:w="4309"/>
+            <w:vAlign w:val="center"/>
+            <w:tcMar>
+              <w:top w:w="70" w:type="dxa"/>
+              <w:start w:w="80" w:type="dxa"/>
+              <w:bottom w:w="70" w:type="dxa"/>
+              <w:end w:w="80" w:type="dxa"/>
+            </w:tcMar>
+            <w:shd w:fill="E4EFEA"/>
+          </w:tcPr>
+          <w:p>
+            <w:pPr>
+              <w:spacing w:after="0" w:line="269" w:lineRule="auto"/>
+              <w:jc w:val="left"/>
+            </w:pPr>
+            <w:r/>
+            <w:r>
+              <w:rPr>
+                <w:rFonts w:ascii="S-Core Dream" w:hAnsi="S-Core Dream" w:eastAsia="에스코어 드림"/>
+                <w:b/>
+                <w:color w:val="154541"/>
+                <w:sz w:val="17"/>
+              </w:rPr>
+              <w:t>자동 기계가 움직이는 기준</w:t>
+            </w:r>
+          </w:p>
+        </w:tc>
+        <w:tc>
+          <w:tcPr>
+            <w:tcW w:type="dxa" w:w="6463"/>
+            <w:vAlign w:val="center"/>
+            <w:tcMar>
+              <w:top w:w="70" w:type="dxa"/>
+              <w:start w:w="80" w:type="dxa"/>
+              <w:bottom w:w="70" w:type="dxa"/>
+              <w:end w:w="80" w:type="dxa"/>
+            </w:tcMar>
+          </w:tcPr>
+          <w:p>
+            <w:pPr>
+              <w:spacing w:after="0" w:line="269" w:lineRule="auto"/>
+              <w:jc w:val="center"/>
+            </w:pPr>
+            <w:r/>
+            <w:r>
+              <w:rPr>
+                <w:rFonts w:ascii="S-Core Dream" w:hAnsi="S-Core Dream" w:eastAsia="에스코어 드림"/>
+                <w:b/>
+                <w:color w:val="233A3E"/>
+                <w:sz w:val="18"/>
+              </w:rPr>
+              <w:t>정해진 조건     /     내 마음</w:t>
+            </w:r>
+          </w:p>
+        </w:tc>
+      </w:tr>
+    </w:tbl>
+    <w:p>
+      <w:pPr>
+        <w:spacing w:before="60" w:after="30"/>
+      </w:pPr>
+      <w:r>
+        <w:rPr>
+          <w:rFonts w:ascii="S-Core Dream" w:hAnsi="S-Core Dream" w:eastAsia="에스코어 드림"/>
+          <w:b/>
+          <w:color w:val="1F5D59"/>
+          <w:sz w:val="20"/>
+        </w:rPr>
+        <w:t xml:space="preserve">3  </w:t>
+      </w:r>
+      <w:r>
+        <w:rPr>
+          <w:rFonts w:ascii="S-Core Dream" w:hAnsi="S-Core Dream" w:eastAsia="에스코어 드림"/>
+          <w:b/>
+          <w:color w:val="233A3E"/>
+          <w:sz w:val="20"/>
+        </w:rPr>
+        <w:t>두 장면을 보고 알맞은 답에 ○표하세요.</w:t>
+      </w:r>
+    </w:p>
+    <w:tbl>
+      <w:tblPr>
+        <w:tblW w:type="auto" w:w="0"/>
+        <w:tblLayout w:type="fixed"/>
+        <w:tblLook w:firstColumn="1" w:firstRow="1" w:lastColumn="0" w:lastRow="0" w:noHBand="0" w:noVBand="1" w:val="04A0"/>
+        <w:tblBorders>
+          <w:top w:val="single" w:sz="5" w:space="0" w:color="AFC0B9"/>
+          <w:left w:val="single" w:sz="5" w:space="0" w:color="AFC0B9"/>
+          <w:bottom w:val="single" w:sz="5" w:space="0" w:color="AFC0B9"/>
+          <w:right w:val="single" w:sz="5" w:space="0" w:color="AFC0B9"/>
+          <w:insideH w:val="single" w:sz="5" w:space="0" w:color="AFC0B9"/>
+          <w:insideV w:val="single" w:sz="5" w:space="0" w:color="AFC0B9"/>
+        </w:tblBorders>
+      </w:tblPr>
+      <w:tblGrid>
+        <w:gridCol w:w="5386"/>
+        <w:gridCol w:w="5386"/>
+      </w:tblGrid>
+      <w:tr>
+        <w:trPr>
+          <w:trHeight w:val="850" w:hRule="atLeast"/>
+        </w:trPr>
+        <w:tc>
+          <w:tcPr>
+            <w:tcW w:type="dxa" w:w="5386"/>
             <w:vAlign w:val="center"/>
             <w:tcMar>
               <w:top w:w="70" w:type="dxa"/>
@@ -1074,15 +1935,17 @@
                 <w:rFonts w:ascii="S-Core Dream" w:hAnsi="S-Core Dream" w:eastAsia="에스코어 드림"/>
                 <w:b/>
                 <w:color w:val="154541"/>
-                <w:sz w:val="15"/>
+                <w:sz w:val="18"/>
               </w:rPr>
-              <w:t>AI 장면과 까닭</w:t>
+              <w:t>내가 본 영상을 보고</w:t>
+              <w:br/>
+              <w:t>다음 영상을 골라 줘요.</w:t>
             </w:r>
           </w:p>
         </w:tc>
         <w:tc>
           <w:tcPr>
-            <w:tcW w:type="dxa" w:w="5329"/>
+            <w:tcW w:type="dxa" w:w="5386"/>
             <w:vAlign w:val="center"/>
             <w:tcMar>
               <w:top w:w="70" w:type="dxa"/>
@@ -1103,20 +1966,22 @@
                 <w:rFonts w:ascii="S-Core Dream" w:hAnsi="S-Core Dream" w:eastAsia="에스코어 드림"/>
                 <w:b/>
                 <w:color w:val="154541"/>
-                <w:sz w:val="15"/>
+                <w:sz w:val="18"/>
               </w:rPr>
-              <w:t>자동 기계 장면과 까닭</w:t>
+              <w:t>10분이 지나면</w:t>
+              <w:br/>
+              <w:t>알람이 울려요.</w:t>
             </w:r>
           </w:p>
         </w:tc>
       </w:tr>
       <w:tr>
         <w:trPr>
-          <w:trHeight w:val="1361" w:hRule="exact"/>
+          <w:trHeight w:val="1191" w:hRule="atLeast"/>
         </w:trPr>
         <w:tc>
           <w:tcPr>
-            <w:tcW w:type="dxa" w:w="5329"/>
+            <w:tcW w:type="dxa" w:w="5386"/>
             <w:vAlign w:val="center"/>
             <w:tcMar>
               <w:top w:w="70" w:type="dxa"/>
@@ -1128,7 +1993,7 @@
           <w:p>
             <w:pPr>
               <w:spacing w:after="0" w:line="269" w:lineRule="auto"/>
-              <w:jc w:val="left"/>
+              <w:jc w:val="center"/>
             </w:pPr>
             <w:r/>
             <w:r>
@@ -1136,15 +2001,17 @@
                 <w:rFonts w:ascii="S-Core Dream" w:hAnsi="S-Core Dream" w:eastAsia="에스코어 드림"/>
                 <w:b w:val="0"/>
                 <w:color w:val="233A3E"/>
-                <w:sz w:val="15"/>
+                <w:sz w:val="17"/>
               </w:rPr>
+              <w:t>AI  /  자동 기계</w:t>
               <w:br/>
+              <w:t>기록에서 특징을 찾아요  /  시간이 지나면 움직여요</w:t>
             </w:r>
           </w:p>
         </w:tc>
         <w:tc>
           <w:tcPr>
-            <w:tcW w:type="dxa" w:w="5329"/>
+            <w:tcW w:type="dxa" w:w="5386"/>
             <w:vAlign w:val="center"/>
             <w:tcMar>
               <w:top w:w="70" w:type="dxa"/>
@@ -1156,7 +2023,7 @@
           <w:p>
             <w:pPr>
               <w:spacing w:after="0" w:line="269" w:lineRule="auto"/>
-              <w:jc w:val="left"/>
+              <w:jc w:val="center"/>
             </w:pPr>
             <w:r/>
             <w:r>
@@ -1164,9 +2031,11 @@
                 <w:rFonts w:ascii="S-Core Dream" w:hAnsi="S-Core Dream" w:eastAsia="에스코어 드림"/>
                 <w:b w:val="0"/>
                 <w:color w:val="233A3E"/>
-                <w:sz w:val="15"/>
+                <w:sz w:val="17"/>
               </w:rPr>
+              <w:t>AI  /  자동 기계</w:t>
               <w:br/>
+              <w:t>기록에서 특징을 찾아요  /  정해진 시간이 지나면 움직여요</w:t>
             </w:r>
           </w:p>
         </w:tc>
@@ -1181,23 +2050,24 @@
           <w:rFonts w:ascii="S-Core Dream" w:hAnsi="S-Core Dream" w:eastAsia="에스코어 드림"/>
           <w:b/>
           <w:color w:val="1F5D59"/>
-          <w:sz w:val="18"/>
+          <w:sz w:val="20"/>
         </w:rPr>
-        <w:t xml:space="preserve">3  </w:t>
+        <w:t xml:space="preserve">4  </w:t>
       </w:r>
       <w:r>
         <w:rPr>
           <w:rFonts w:ascii="S-Core Dream" w:hAnsi="S-Core Dream" w:eastAsia="에스코어 드림"/>
           <w:b/>
           <w:color w:val="233A3E"/>
-          <w:sz w:val="18"/>
+          <w:sz w:val="20"/>
         </w:rPr>
-        <w:t>오늘 배운 내용을 완성하세요.</w:t>
+        <w:t>오늘 나는 어땠나요? 하나에 ○표하세요.</w:t>
       </w:r>
     </w:p>
     <w:tbl>
       <w:tblPr>
         <w:tblW w:type="auto" w:w="0"/>
+        <w:tblLayout w:type="fixed"/>
         <w:tblLook w:firstColumn="1" w:firstRow="1" w:lastColumn="0" w:lastRow="0" w:noHBand="0" w:noVBand="1" w:val="04A0"/>
         <w:tblBorders>
           <w:top w:val="single" w:sz="5" w:space="0" w:color="AFC0B9"/>
@@ -1209,15 +2079,46 @@
         </w:tblBorders>
       </w:tblPr>
       <w:tblGrid>
-        <w:gridCol w:w="10658"/>
+        <w:gridCol w:w="3589"/>
+        <w:gridCol w:w="3589"/>
+        <w:gridCol w:w="3594"/>
       </w:tblGrid>
       <w:tr>
         <w:trPr>
-          <w:trHeight w:val="1077" w:hRule="exact"/>
+          <w:trHeight w:val="794" w:hRule="atLeast"/>
         </w:trPr>
         <w:tc>
           <w:tcPr>
-            <w:tcW w:type="dxa" w:w="10658"/>
+            <w:tcW w:type="dxa" w:w="3589"/>
+            <w:vAlign w:val="center"/>
+            <w:tcMar>
+              <w:top w:w="70" w:type="dxa"/>
+              <w:start w:w="80" w:type="dxa"/>
+              <w:bottom w:w="70" w:type="dxa"/>
+              <w:end w:w="80" w:type="dxa"/>
+            </w:tcMar>
+            <w:shd w:fill="E4EFEA"/>
+          </w:tcPr>
+          <w:p>
+            <w:pPr>
+              <w:spacing w:after="0" w:line="269" w:lineRule="auto"/>
+              <w:jc w:val="center"/>
+            </w:pPr>
+            <w:r/>
+            <w:r>
+              <w:rPr>
+                <w:rFonts w:ascii="S-Core Dream" w:hAnsi="S-Core Dream" w:eastAsia="에스코어 드림"/>
+                <w:b/>
+                <w:color w:val="154541"/>
+                <w:sz w:val="18"/>
+              </w:rPr>
+              <w:t>잘 알겠어요</w:t>
+            </w:r>
+          </w:p>
+        </w:tc>
+        <w:tc>
+          <w:tcPr>
+            <w:tcW w:type="dxa" w:w="3589"/>
             <w:vAlign w:val="center"/>
             <w:tcMar>
               <w:top w:w="70" w:type="dxa"/>
@@ -1236,64 +2137,17 @@
             <w:r>
               <w:rPr>
                 <w:rFonts w:ascii="S-Core Dream" w:hAnsi="S-Core Dream" w:eastAsia="에스코어 드림"/>
-                <w:b w:val="0"/>
+                <w:b/>
                 <w:color w:val="233A3E"/>
-                <w:sz w:val="16"/>
+                <w:sz w:val="18"/>
               </w:rPr>
-              <w:t>자동 기계는  ____________________  에 따라 움직이고,</w:t>
-              <w:br/>
-              <w:t>AI는 데이터에서  ____________________  을 찾아 추천·인식·분류합니다.</w:t>
+              <w:t>조금 헷갈려요</w:t>
             </w:r>
           </w:p>
         </w:tc>
-      </w:tr>
-    </w:tbl>
-    <w:p>
-      <w:pPr>
-        <w:spacing w:before="60" w:after="30"/>
-      </w:pPr>
-      <w:r>
-        <w:rPr>
-          <w:rFonts w:ascii="S-Core Dream" w:hAnsi="S-Core Dream" w:eastAsia="에스코어 드림"/>
-          <w:b/>
-          <w:color w:val="1F5D59"/>
-          <w:sz w:val="18"/>
-        </w:rPr>
-        <w:t xml:space="preserve">4  </w:t>
-      </w:r>
-      <w:r>
-        <w:rPr>
-          <w:rFonts w:ascii="S-Core Dream" w:hAnsi="S-Core Dream" w:eastAsia="에스코어 드림"/>
-          <w:b/>
-          <w:color w:val="233A3E"/>
-          <w:sz w:val="18"/>
-        </w:rPr>
-        <w:t>오늘 새롭게 알게 된 점을 한 문장으로 쓰세요.</w:t>
-      </w:r>
-    </w:p>
-    <w:tbl>
-      <w:tblPr>
-        <w:tblW w:type="auto" w:w="0"/>
-        <w:tblLook w:firstColumn="1" w:firstRow="1" w:lastColumn="0" w:lastRow="0" w:noHBand="0" w:noVBand="1" w:val="04A0"/>
-        <w:tblBorders>
-          <w:top w:val="single" w:sz="5" w:space="0" w:color="AFC0B9"/>
-          <w:left w:val="single" w:sz="5" w:space="0" w:color="AFC0B9"/>
-          <w:bottom w:val="single" w:sz="5" w:space="0" w:color="AFC0B9"/>
-          <w:right w:val="single" w:sz="5" w:space="0" w:color="AFC0B9"/>
-          <w:insideH w:val="single" w:sz="5" w:space="0" w:color="AFC0B9"/>
-          <w:insideV w:val="single" w:sz="5" w:space="0" w:color="AFC0B9"/>
-        </w:tblBorders>
-      </w:tblPr>
-      <w:tblGrid>
-        <w:gridCol w:w="10658"/>
-      </w:tblGrid>
-      <w:tr>
-        <w:trPr>
-          <w:trHeight w:val="1247" w:hRule="exact"/>
-        </w:trPr>
         <w:tc>
           <w:tcPr>
-            <w:tcW w:type="dxa" w:w="10658"/>
+            <w:tcW w:type="dxa" w:w="3594"/>
             <w:vAlign w:val="center"/>
             <w:tcMar>
               <w:top w:w="70" w:type="dxa"/>
@@ -1301,21 +2155,22 @@
               <w:bottom w:w="70" w:type="dxa"/>
               <w:end w:w="80" w:type="dxa"/>
             </w:tcMar>
+            <w:shd w:fill="FFFDF7"/>
           </w:tcPr>
           <w:p>
             <w:pPr>
               <w:spacing w:after="0" w:line="269" w:lineRule="auto"/>
-              <w:jc w:val="left"/>
+              <w:jc w:val="center"/>
             </w:pPr>
             <w:r/>
             <w:r>
               <w:rPr>
                 <w:rFonts w:ascii="S-Core Dream" w:hAnsi="S-Core Dream" w:eastAsia="에스코어 드림"/>
-                <w:b w:val="0"/>
+                <w:b/>
                 <w:color w:val="233A3E"/>
-                <w:sz w:val="16"/>
+                <w:sz w:val="18"/>
               </w:rPr>
-              <w:br/>
+              <w:t>더 알아볼래요</w:t>
             </w:r>
           </w:p>
         </w:tc>
@@ -1324,7 +2179,7 @@
     <w:sectPr>
       <w:footerReference w:type="default" r:id="rId9"/>
       <w:pgSz w:w="11906" w:h="16838"/>
-      <w:pgMar w:top="510" w:right="624" w:bottom="454" w:left="624" w:header="720" w:footer="720" w:gutter="0"/>
+      <w:pgMar w:top="454" w:right="567" w:bottom="454" w:left="567" w:header="720" w:footer="720" w:gutter="0"/>
       <w:cols w:space="720"/>
       <w:docGrid w:linePitch="360"/>
     </w:sectPr>

</xml_diff>